<commit_message>
thêm đường dẫn git
</commit_message>
<xml_diff>
--- a/CSDL.docx
+++ b/CSDL.docx
@@ -27,7 +27,7 @@
         <mc:AlternateContent>
           <mc:Choice Requires="wpg">
             <w:drawing>
-              <wp:anchor distT="0" distB="0" distL="114300" distR="114300" simplePos="0" relativeHeight="251676672" behindDoc="0" locked="0" layoutInCell="1" allowOverlap="1" wp14:anchorId="11946D24" wp14:editId="0346ABBD">
+              <wp:anchor distT="0" distB="0" distL="114300" distR="114300" simplePos="0" relativeHeight="251676672" behindDoc="0" locked="0" layoutInCell="1" allowOverlap="1" wp14:anchorId="11946D24" wp14:editId="01C61FA7">
                 <wp:simplePos x="0" y="0"/>
                 <wp:positionH relativeFrom="column">
                   <wp:posOffset>-381000</wp:posOffset>
@@ -116,14 +116,14 @@
                           </a:ln>
                           <a:extLst>
                             <a:ext uri="{909E8E84-426E-40dd-AFC4-6F175D3DCCD1}">
-                              <a14:hiddenFill xmlns:lc="http://schemas.openxmlformats.org/drawingml/2006/lockedCanvas" xmlns:a14="http://schemas.microsoft.com/office/drawing/2010/main" xmlns:w="http://schemas.openxmlformats.org/wordprocessingml/2006/main" xmlns:w10="urn:schemas-microsoft-com:office:word" xmlns:v="urn:schemas-microsoft-com:vml" xmlns:o="urn:schemas-microsoft-com:office:office" xmlns:mv="urn:schemas-microsoft-com:mac:vml" xmlns:mo="http://schemas.microsoft.com/office/mac/office/2008/main" xmlns="">
+                              <a14:hiddenFill xmlns="" xmlns:mo="http://schemas.microsoft.com/office/mac/office/2008/main" xmlns:mv="urn:schemas-microsoft-com:mac:vml" xmlns:o="urn:schemas-microsoft-com:office:office" xmlns:v="urn:schemas-microsoft-com:vml" xmlns:w10="urn:schemas-microsoft-com:office:word" xmlns:w="http://schemas.openxmlformats.org/wordprocessingml/2006/main" xmlns:a14="http://schemas.microsoft.com/office/drawing/2010/main" xmlns:lc="http://schemas.openxmlformats.org/drawingml/2006/lockedCanvas">
                                 <a:solidFill>
                                   <a:srgbClr val="FFFFFF"/>
                                 </a:solidFill>
                               </a14:hiddenFill>
                             </a:ext>
                             <a:ext uri="{91240B29-F687-4f45-9708-019B960494DF}">
-                              <a14:hiddenLine xmlns:lc="http://schemas.openxmlformats.org/drawingml/2006/lockedCanvas" xmlns:a14="http://schemas.microsoft.com/office/drawing/2010/main" xmlns:w="http://schemas.openxmlformats.org/wordprocessingml/2006/main" xmlns:w10="urn:schemas-microsoft-com:office:word" xmlns:v="urn:schemas-microsoft-com:vml" xmlns:o="urn:schemas-microsoft-com:office:office" xmlns:mv="urn:schemas-microsoft-com:mac:vml" xmlns:mo="http://schemas.microsoft.com/office/mac/office/2008/main" xmlns="" w="9525">
+                              <a14:hiddenLine xmlns="" xmlns:mo="http://schemas.microsoft.com/office/mac/office/2008/main" xmlns:mv="urn:schemas-microsoft-com:mac:vml" xmlns:o="urn:schemas-microsoft-com:office:office" xmlns:v="urn:schemas-microsoft-com:vml" xmlns:w10="urn:schemas-microsoft-com:office:word" xmlns:w="http://schemas.openxmlformats.org/wordprocessingml/2006/main" xmlns:a14="http://schemas.microsoft.com/office/drawing/2010/main" xmlns:lc="http://schemas.openxmlformats.org/drawingml/2006/lockedCanvas" w="9525">
                                 <a:solidFill>
                                   <a:srgbClr val="000000"/>
                                 </a:solidFill>
@@ -231,14 +231,14 @@
                           </a:ln>
                           <a:extLst>
                             <a:ext uri="{909E8E84-426E-40dd-AFC4-6F175D3DCCD1}">
-                              <a14:hiddenFill xmlns:lc="http://schemas.openxmlformats.org/drawingml/2006/lockedCanvas" xmlns:a14="http://schemas.microsoft.com/office/drawing/2010/main" xmlns:w="http://schemas.openxmlformats.org/wordprocessingml/2006/main" xmlns:w10="urn:schemas-microsoft-com:office:word" xmlns:v="urn:schemas-microsoft-com:vml" xmlns:o="urn:schemas-microsoft-com:office:office" xmlns:mv="urn:schemas-microsoft-com:mac:vml" xmlns:mo="http://schemas.microsoft.com/office/mac/office/2008/main" xmlns="">
+                              <a14:hiddenFill xmlns="" xmlns:mo="http://schemas.microsoft.com/office/mac/office/2008/main" xmlns:mv="urn:schemas-microsoft-com:mac:vml" xmlns:o="urn:schemas-microsoft-com:office:office" xmlns:v="urn:schemas-microsoft-com:vml" xmlns:w10="urn:schemas-microsoft-com:office:word" xmlns:w="http://schemas.openxmlformats.org/wordprocessingml/2006/main" xmlns:a14="http://schemas.microsoft.com/office/drawing/2010/main" xmlns:lc="http://schemas.openxmlformats.org/drawingml/2006/lockedCanvas">
                                 <a:solidFill>
                                   <a:srgbClr val="FFFFFF"/>
                                 </a:solidFill>
                               </a14:hiddenFill>
                             </a:ext>
                             <a:ext uri="{91240B29-F687-4f45-9708-019B960494DF}">
-                              <a14:hiddenLine xmlns:lc="http://schemas.openxmlformats.org/drawingml/2006/lockedCanvas" xmlns:a14="http://schemas.microsoft.com/office/drawing/2010/main" xmlns:w="http://schemas.openxmlformats.org/wordprocessingml/2006/main" xmlns:w10="urn:schemas-microsoft-com:office:word" xmlns:v="urn:schemas-microsoft-com:vml" xmlns:o="urn:schemas-microsoft-com:office:office" xmlns:mv="urn:schemas-microsoft-com:mac:vml" xmlns:mo="http://schemas.microsoft.com/office/mac/office/2008/main" xmlns="" w="9525">
+                              <a14:hiddenLine xmlns="" xmlns:mo="http://schemas.microsoft.com/office/mac/office/2008/main" xmlns:mv="urn:schemas-microsoft-com:mac:vml" xmlns:o="urn:schemas-microsoft-com:office:office" xmlns:v="urn:schemas-microsoft-com:vml" xmlns:w10="urn:schemas-microsoft-com:office:word" xmlns:w="http://schemas.openxmlformats.org/wordprocessingml/2006/main" xmlns:a14="http://schemas.microsoft.com/office/drawing/2010/main" xmlns:lc="http://schemas.openxmlformats.org/drawingml/2006/lockedCanvas" w="9525">
                                 <a:solidFill>
                                   <a:srgbClr val="000000"/>
                                 </a:solidFill>
@@ -284,14 +284,14 @@
                           </a:ln>
                           <a:extLst>
                             <a:ext uri="{909E8E84-426E-40dd-AFC4-6F175D3DCCD1}">
-                              <a14:hiddenFill xmlns:lc="http://schemas.openxmlformats.org/drawingml/2006/lockedCanvas" xmlns:a14="http://schemas.microsoft.com/office/drawing/2010/main" xmlns:w="http://schemas.openxmlformats.org/wordprocessingml/2006/main" xmlns:w10="urn:schemas-microsoft-com:office:word" xmlns:v="urn:schemas-microsoft-com:vml" xmlns:o="urn:schemas-microsoft-com:office:office" xmlns:mv="urn:schemas-microsoft-com:mac:vml" xmlns:mo="http://schemas.microsoft.com/office/mac/office/2008/main" xmlns="">
+                              <a14:hiddenFill xmlns="" xmlns:mo="http://schemas.microsoft.com/office/mac/office/2008/main" xmlns:mv="urn:schemas-microsoft-com:mac:vml" xmlns:o="urn:schemas-microsoft-com:office:office" xmlns:v="urn:schemas-microsoft-com:vml" xmlns:w10="urn:schemas-microsoft-com:office:word" xmlns:w="http://schemas.openxmlformats.org/wordprocessingml/2006/main" xmlns:a14="http://schemas.microsoft.com/office/drawing/2010/main" xmlns:lc="http://schemas.openxmlformats.org/drawingml/2006/lockedCanvas">
                                 <a:solidFill>
                                   <a:srgbClr val="FFFFFF"/>
                                 </a:solidFill>
                               </a14:hiddenFill>
                             </a:ext>
                             <a:ext uri="{91240B29-F687-4f45-9708-019B960494DF}">
-                              <a14:hiddenLine xmlns:lc="http://schemas.openxmlformats.org/drawingml/2006/lockedCanvas" xmlns:a14="http://schemas.microsoft.com/office/drawing/2010/main" xmlns:w="http://schemas.openxmlformats.org/wordprocessingml/2006/main" xmlns:w10="urn:schemas-microsoft-com:office:word" xmlns:v="urn:schemas-microsoft-com:vml" xmlns:o="urn:schemas-microsoft-com:office:office" xmlns:mv="urn:schemas-microsoft-com:mac:vml" xmlns:mo="http://schemas.microsoft.com/office/mac/office/2008/main" xmlns="" w="9525">
+                              <a14:hiddenLine xmlns="" xmlns:mo="http://schemas.microsoft.com/office/mac/office/2008/main" xmlns:mv="urn:schemas-microsoft-com:mac:vml" xmlns:o="urn:schemas-microsoft-com:office:office" xmlns:v="urn:schemas-microsoft-com:vml" xmlns:w10="urn:schemas-microsoft-com:office:word" xmlns:w="http://schemas.openxmlformats.org/wordprocessingml/2006/main" xmlns:a14="http://schemas.microsoft.com/office/drawing/2010/main" xmlns:lc="http://schemas.openxmlformats.org/drawingml/2006/lockedCanvas" w="9525">
                                 <a:solidFill>
                                   <a:srgbClr val="000000"/>
                                 </a:solidFill>
@@ -363,14 +363,14 @@
                           </a:ln>
                           <a:extLst>
                             <a:ext uri="{909E8E84-426E-40dd-AFC4-6F175D3DCCD1}">
-                              <a14:hiddenFill xmlns:lc="http://schemas.openxmlformats.org/drawingml/2006/lockedCanvas" xmlns:a14="http://schemas.microsoft.com/office/drawing/2010/main" xmlns:w="http://schemas.openxmlformats.org/wordprocessingml/2006/main" xmlns:w10="urn:schemas-microsoft-com:office:word" xmlns:v="urn:schemas-microsoft-com:vml" xmlns:o="urn:schemas-microsoft-com:office:office" xmlns:mv="urn:schemas-microsoft-com:mac:vml" xmlns:mo="http://schemas.microsoft.com/office/mac/office/2008/main" xmlns="">
+                              <a14:hiddenFill xmlns="" xmlns:mo="http://schemas.microsoft.com/office/mac/office/2008/main" xmlns:mv="urn:schemas-microsoft-com:mac:vml" xmlns:o="urn:schemas-microsoft-com:office:office" xmlns:v="urn:schemas-microsoft-com:vml" xmlns:w10="urn:schemas-microsoft-com:office:word" xmlns:w="http://schemas.openxmlformats.org/wordprocessingml/2006/main" xmlns:a14="http://schemas.microsoft.com/office/drawing/2010/main" xmlns:lc="http://schemas.openxmlformats.org/drawingml/2006/lockedCanvas">
                                 <a:solidFill>
                                   <a:srgbClr val="FFFFFF"/>
                                 </a:solidFill>
                               </a14:hiddenFill>
                             </a:ext>
                             <a:ext uri="{91240B29-F687-4f45-9708-019B960494DF}">
-                              <a14:hiddenLine xmlns:lc="http://schemas.openxmlformats.org/drawingml/2006/lockedCanvas" xmlns:a14="http://schemas.microsoft.com/office/drawing/2010/main" xmlns:w="http://schemas.openxmlformats.org/wordprocessingml/2006/main" xmlns:w10="urn:schemas-microsoft-com:office:word" xmlns:v="urn:schemas-microsoft-com:vml" xmlns:o="urn:schemas-microsoft-com:office:office" xmlns:mv="urn:schemas-microsoft-com:mac:vml" xmlns:mo="http://schemas.microsoft.com/office/mac/office/2008/main" xmlns="" w="9525">
+                              <a14:hiddenLine xmlns="" xmlns:mo="http://schemas.microsoft.com/office/mac/office/2008/main" xmlns:mv="urn:schemas-microsoft-com:mac:vml" xmlns:o="urn:schemas-microsoft-com:office:office" xmlns:v="urn:schemas-microsoft-com:vml" xmlns:w10="urn:schemas-microsoft-com:office:word" xmlns:w="http://schemas.openxmlformats.org/wordprocessingml/2006/main" xmlns:a14="http://schemas.microsoft.com/office/drawing/2010/main" xmlns:lc="http://schemas.openxmlformats.org/drawingml/2006/lockedCanvas" w="9525">
                                 <a:solidFill>
                                   <a:srgbClr val="000000"/>
                                 </a:solidFill>
@@ -404,7 +404,7 @@
                           </a:ln>
                           <a:extLst>
                             <a:ext uri="{909E8E84-426E-40dd-AFC4-6F175D3DCCD1}">
-                              <a14:hiddenFill xmlns:lc="http://schemas.openxmlformats.org/drawingml/2006/lockedCanvas" xmlns:a14="http://schemas.microsoft.com/office/drawing/2010/main" xmlns:w="http://schemas.openxmlformats.org/wordprocessingml/2006/main" xmlns:w10="urn:schemas-microsoft-com:office:word" xmlns:v="urn:schemas-microsoft-com:vml" xmlns:o="urn:schemas-microsoft-com:office:office" xmlns:mv="urn:schemas-microsoft-com:mac:vml" xmlns:mo="http://schemas.microsoft.com/office/mac/office/2008/main" xmlns="">
+                              <a14:hiddenFill xmlns="" xmlns:mo="http://schemas.microsoft.com/office/mac/office/2008/main" xmlns:mv="urn:schemas-microsoft-com:mac:vml" xmlns:o="urn:schemas-microsoft-com:office:office" xmlns:v="urn:schemas-microsoft-com:vml" xmlns:w10="urn:schemas-microsoft-com:office:word" xmlns:w="http://schemas.openxmlformats.org/wordprocessingml/2006/main" xmlns:a14="http://schemas.microsoft.com/office/drawing/2010/main" xmlns:lc="http://schemas.openxmlformats.org/drawingml/2006/lockedCanvas">
                                 <a:noFill/>
                               </a14:hiddenFill>
                             </a:ext>
@@ -434,7 +434,7 @@
                           </a:ln>
                           <a:extLst>
                             <a:ext uri="{909E8E84-426E-40dd-AFC4-6F175D3DCCD1}">
-                              <a14:hiddenFill xmlns:lc="http://schemas.openxmlformats.org/drawingml/2006/lockedCanvas" xmlns:a14="http://schemas.microsoft.com/office/drawing/2010/main" xmlns:w="http://schemas.openxmlformats.org/wordprocessingml/2006/main" xmlns:w10="urn:schemas-microsoft-com:office:word" xmlns:v="urn:schemas-microsoft-com:vml" xmlns:o="urn:schemas-microsoft-com:office:office" xmlns:mv="urn:schemas-microsoft-com:mac:vml" xmlns:mo="http://schemas.microsoft.com/office/mac/office/2008/main" xmlns="">
+                              <a14:hiddenFill xmlns="" xmlns:mo="http://schemas.microsoft.com/office/mac/office/2008/main" xmlns:mv="urn:schemas-microsoft-com:mac:vml" xmlns:o="urn:schemas-microsoft-com:office:office" xmlns:v="urn:schemas-microsoft-com:vml" xmlns:w10="urn:schemas-microsoft-com:office:word" xmlns:w="http://schemas.openxmlformats.org/wordprocessingml/2006/main" xmlns:a14="http://schemas.microsoft.com/office/drawing/2010/main" xmlns:lc="http://schemas.openxmlformats.org/drawingml/2006/lockedCanvas">
                                 <a:noFill/>
                               </a14:hiddenFill>
                             </a:ext>
@@ -464,7 +464,7 @@
                           </a:ln>
                           <a:extLst>
                             <a:ext uri="{909E8E84-426E-40dd-AFC4-6F175D3DCCD1}">
-                              <a14:hiddenFill xmlns:lc="http://schemas.openxmlformats.org/drawingml/2006/lockedCanvas" xmlns:a14="http://schemas.microsoft.com/office/drawing/2010/main" xmlns:w="http://schemas.openxmlformats.org/wordprocessingml/2006/main" xmlns:w10="urn:schemas-microsoft-com:office:word" xmlns:v="urn:schemas-microsoft-com:vml" xmlns:o="urn:schemas-microsoft-com:office:office" xmlns:mv="urn:schemas-microsoft-com:mac:vml" xmlns:mo="http://schemas.microsoft.com/office/mac/office/2008/main" xmlns="">
+                              <a14:hiddenFill xmlns="" xmlns:mo="http://schemas.microsoft.com/office/mac/office/2008/main" xmlns:mv="urn:schemas-microsoft-com:mac:vml" xmlns:o="urn:schemas-microsoft-com:office:office" xmlns:v="urn:schemas-microsoft-com:vml" xmlns:w10="urn:schemas-microsoft-com:office:word" xmlns:w="http://schemas.openxmlformats.org/wordprocessingml/2006/main" xmlns:a14="http://schemas.microsoft.com/office/drawing/2010/main" xmlns:lc="http://schemas.openxmlformats.org/drawingml/2006/lockedCanvas">
                                 <a:noFill/>
                               </a14:hiddenFill>
                             </a:ext>
@@ -494,7 +494,7 @@
                           </a:ln>
                           <a:extLst>
                             <a:ext uri="{909E8E84-426E-40dd-AFC4-6F175D3DCCD1}">
-                              <a14:hiddenFill xmlns:lc="http://schemas.openxmlformats.org/drawingml/2006/lockedCanvas" xmlns:a14="http://schemas.microsoft.com/office/drawing/2010/main" xmlns:w="http://schemas.openxmlformats.org/wordprocessingml/2006/main" xmlns:w10="urn:schemas-microsoft-com:office:word" xmlns:v="urn:schemas-microsoft-com:vml" xmlns:o="urn:schemas-microsoft-com:office:office" xmlns:mv="urn:schemas-microsoft-com:mac:vml" xmlns:mo="http://schemas.microsoft.com/office/mac/office/2008/main" xmlns="">
+                              <a14:hiddenFill xmlns="" xmlns:mo="http://schemas.microsoft.com/office/mac/office/2008/main" xmlns:mv="urn:schemas-microsoft-com:mac:vml" xmlns:o="urn:schemas-microsoft-com:office:office" xmlns:v="urn:schemas-microsoft-com:vml" xmlns:w10="urn:schemas-microsoft-com:office:word" xmlns:w="http://schemas.openxmlformats.org/wordprocessingml/2006/main" xmlns:a14="http://schemas.microsoft.com/office/drawing/2010/main" xmlns:lc="http://schemas.openxmlformats.org/drawingml/2006/lockedCanvas">
                                 <a:noFill/>
                               </a14:hiddenFill>
                             </a:ext>
@@ -5672,24 +5672,24 @@
           <w:lang w:val="en-US"/>
         </w:rPr>
       </w:pPr>
-      <w:bookmarkStart w:id="21" w:name="_Toc225869346"/>
-      <w:bookmarkStart w:id="22" w:name="_Toc225869674"/>
-      <w:bookmarkStart w:id="23" w:name="_Toc227057605"/>
+      <w:bookmarkStart w:id="21" w:name="_Toc227057605"/>
+      <w:bookmarkStart w:id="22" w:name="_Toc225869346"/>
+      <w:bookmarkStart w:id="23" w:name="_Toc225869674"/>
       <w:r>
         <w:rPr>
           <w:rFonts w:ascii="Times New Roman" w:hAnsi="Times New Roman" w:cs="Times New Roman"/>
         </w:rPr>
         <w:t>Hình 1. 1: Mô hình quan hệ thực thể ER</w:t>
       </w:r>
+      <w:bookmarkEnd w:id="21"/>
+      <w:r>
+        <w:rPr>
+          <w:rFonts w:ascii="Times New Roman" w:hAnsi="Times New Roman" w:cs="Times New Roman"/>
+        </w:rPr>
+        <w:t xml:space="preserve"> </w:t>
+      </w:r>
+      <w:bookmarkEnd w:id="22"/>
       <w:bookmarkEnd w:id="23"/>
-      <w:r>
-        <w:rPr>
-          <w:rFonts w:ascii="Times New Roman" w:hAnsi="Times New Roman" w:cs="Times New Roman"/>
-        </w:rPr>
-        <w:t xml:space="preserve"> </w:t>
-      </w:r>
-      <w:bookmarkEnd w:id="21"/>
-      <w:bookmarkEnd w:id="22"/>
     </w:p>
     <w:p>
       <w:pPr>
@@ -11259,6 +11259,7 @@
       <w:r>
         <w:rPr>
           <w:rFonts w:ascii="Times New Roman" w:hAnsi="Times New Roman" w:cs="Times New Roman"/>
+          <w:noProof/>
         </w:rPr>
         <w:drawing>
           <wp:inline distT="0" distB="0" distL="0" distR="0" wp14:anchorId="2C09FEC8" wp14:editId="64D2E3C8">
@@ -11305,24 +11306,24 @@
           <w:lang w:val="en-US"/>
         </w:rPr>
       </w:pPr>
-      <w:bookmarkStart w:id="37" w:name="_Toc225869353"/>
-      <w:bookmarkStart w:id="38" w:name="_Toc225869837"/>
-      <w:bookmarkStart w:id="39" w:name="_Toc227057607"/>
+      <w:bookmarkStart w:id="37" w:name="_Toc227057607"/>
+      <w:bookmarkStart w:id="38" w:name="_Toc225869353"/>
+      <w:bookmarkStart w:id="39" w:name="_Toc225869837"/>
       <w:r>
         <w:rPr>
           <w:rFonts w:ascii="Times New Roman" w:hAnsi="Times New Roman" w:cs="Times New Roman"/>
         </w:rPr>
         <w:t>Hình 1.3: Lược đồ CSDL mức logic</w:t>
       </w:r>
+      <w:bookmarkEnd w:id="37"/>
+      <w:r>
+        <w:rPr>
+          <w:rFonts w:ascii="Times New Roman" w:hAnsi="Times New Roman" w:cs="Times New Roman"/>
+        </w:rPr>
+        <w:t xml:space="preserve"> </w:t>
+      </w:r>
+      <w:bookmarkEnd w:id="38"/>
       <w:bookmarkEnd w:id="39"/>
-      <w:r>
-        <w:rPr>
-          <w:rFonts w:ascii="Times New Roman" w:hAnsi="Times New Roman" w:cs="Times New Roman"/>
-        </w:rPr>
-        <w:t xml:space="preserve"> </w:t>
-      </w:r>
-      <w:bookmarkEnd w:id="37"/>
-      <w:bookmarkEnd w:id="38"/>
     </w:p>
     <w:p>
       <w:pPr>
@@ -12528,9 +12529,15 @@
                             <w:r>
                               <w:rPr>
                                 <w:rFonts w:ascii="Times New Roman" w:hAnsi="Times New Roman" w:cs="Times New Roman"/>
+                              </w:rPr>
+                              <w:t xml:space="preserve">    </w:t>
+                            </w:r>
+                            <w:r>
+                              <w:rPr>
+                                <w:rFonts w:ascii="Times New Roman" w:hAnsi="Times New Roman" w:cs="Times New Roman"/>
                                 <w:lang w:val="fr-FR"/>
                               </w:rPr>
-                              <w:t xml:space="preserve">    UNIQUE (ma_phong, hang, cot),</w:t>
+                              <w:t>UNIQUE (ma_phong, hang, cot),</w:t>
                             </w:r>
                           </w:p>
                           <w:p>
@@ -12629,7 +12636,6 @@
                             <w:pPr>
                               <w:rPr>
                                 <w:rFonts w:ascii="Times New Roman" w:hAnsi="Times New Roman" w:cs="Times New Roman"/>
-                                <w:lang w:val="fr-FR"/>
                               </w:rPr>
                             </w:pPr>
                             <w:r>
@@ -12641,7 +12647,6 @@
                             <w:r>
                               <w:rPr>
                                 <w:rFonts w:ascii="Times New Roman" w:hAnsi="Times New Roman" w:cs="Times New Roman"/>
-                                <w:lang w:val="fr-FR"/>
                               </w:rPr>
                               <w:t xml:space="preserve">ma_suat_chieu INT NOT NULL </w:t>
                             </w:r>
@@ -12654,7 +12659,6 @@
                             <w:r>
                               <w:rPr>
                                 <w:rFonts w:ascii="Times New Roman" w:hAnsi="Times New Roman" w:cs="Times New Roman"/>
-                                <w:lang w:val="fr-FR"/>
                               </w:rPr>
                               <w:t>,</w:t>
                             </w:r>
@@ -12668,7 +12672,6 @@
                             <w:r>
                               <w:rPr>
                                 <w:rFonts w:ascii="Times New Roman" w:hAnsi="Times New Roman" w:cs="Times New Roman"/>
-                                <w:lang w:val="fr-FR"/>
                               </w:rPr>
                               <w:t xml:space="preserve">    </w:t>
                             </w:r>
@@ -13384,9 +13387,15 @@
                       <w:r>
                         <w:rPr>
                           <w:rFonts w:ascii="Times New Roman" w:hAnsi="Times New Roman" w:cs="Times New Roman"/>
+                        </w:rPr>
+                        <w:t xml:space="preserve">    </w:t>
+                      </w:r>
+                      <w:r>
+                        <w:rPr>
+                          <w:rFonts w:ascii="Times New Roman" w:hAnsi="Times New Roman" w:cs="Times New Roman"/>
                           <w:lang w:val="fr-FR"/>
                         </w:rPr>
-                        <w:t xml:space="preserve">    UNIQUE (ma_phong, hang, cot),</w:t>
+                        <w:t>UNIQUE (ma_phong, hang, cot),</w:t>
                       </w:r>
                     </w:p>
                     <w:p>
@@ -13485,7 +13494,6 @@
                       <w:pPr>
                         <w:rPr>
                           <w:rFonts w:ascii="Times New Roman" w:hAnsi="Times New Roman" w:cs="Times New Roman"/>
-                          <w:lang w:val="fr-FR"/>
                         </w:rPr>
                       </w:pPr>
                       <w:r>
@@ -13497,7 +13505,6 @@
                       <w:r>
                         <w:rPr>
                           <w:rFonts w:ascii="Times New Roman" w:hAnsi="Times New Roman" w:cs="Times New Roman"/>
-                          <w:lang w:val="fr-FR"/>
                         </w:rPr>
                         <w:t xml:space="preserve">ma_suat_chieu INT NOT NULL </w:t>
                       </w:r>
@@ -13510,7 +13517,6 @@
                       <w:r>
                         <w:rPr>
                           <w:rFonts w:ascii="Times New Roman" w:hAnsi="Times New Roman" w:cs="Times New Roman"/>
-                          <w:lang w:val="fr-FR"/>
                         </w:rPr>
                         <w:t>,</w:t>
                       </w:r>
@@ -13524,7 +13530,6 @@
                       <w:r>
                         <w:rPr>
                           <w:rFonts w:ascii="Times New Roman" w:hAnsi="Times New Roman" w:cs="Times New Roman"/>
-                          <w:lang w:val="fr-FR"/>
                         </w:rPr>
                         <w:t xml:space="preserve">    </w:t>
                       </w:r>
@@ -14414,7 +14419,6 @@
                             <w:pPr>
                               <w:rPr>
                                 <w:rFonts w:ascii="Times New Roman" w:hAnsi="Times New Roman" w:cs="Times New Roman"/>
-                                <w:lang w:val="fr-FR"/>
                               </w:rPr>
                             </w:pPr>
                             <w:r>
@@ -14426,7 +14430,6 @@
                             <w:r>
                               <w:rPr>
                                 <w:rFonts w:ascii="Times New Roman" w:hAnsi="Times New Roman" w:cs="Times New Roman"/>
-                                <w:lang w:val="fr-FR"/>
                               </w:rPr>
                               <w:t xml:space="preserve">ma_ve INT NOT NULL </w:t>
                             </w:r>
@@ -14439,7 +14442,6 @@
                             <w:r>
                               <w:rPr>
                                 <w:rFonts w:ascii="Times New Roman" w:hAnsi="Times New Roman" w:cs="Times New Roman"/>
-                                <w:lang w:val="fr-FR"/>
                               </w:rPr>
                               <w:t>,</w:t>
                             </w:r>
@@ -14448,13 +14450,11 @@
                             <w:pPr>
                               <w:rPr>
                                 <w:rFonts w:ascii="Times New Roman" w:hAnsi="Times New Roman" w:cs="Times New Roman"/>
-                                <w:lang w:val="fr-FR"/>
-                              </w:rPr>
-                            </w:pPr>
-                            <w:r>
-                              <w:rPr>
-                                <w:rFonts w:ascii="Times New Roman" w:hAnsi="Times New Roman" w:cs="Times New Roman"/>
-                                <w:lang w:val="fr-FR"/>
+                              </w:rPr>
+                            </w:pPr>
+                            <w:r>
+                              <w:rPr>
+                                <w:rFonts w:ascii="Times New Roman" w:hAnsi="Times New Roman" w:cs="Times New Roman"/>
                               </w:rPr>
                               <w:t xml:space="preserve">    ma_suat_chieu INT NOT NULL,</w:t>
                             </w:r>
@@ -14468,7 +14468,6 @@
                             <w:r>
                               <w:rPr>
                                 <w:rFonts w:ascii="Times New Roman" w:hAnsi="Times New Roman" w:cs="Times New Roman"/>
-                                <w:lang w:val="fr-FR"/>
                               </w:rPr>
                               <w:t xml:space="preserve">    </w:t>
                             </w:r>
@@ -14831,7 +14830,6 @@
                       <w:pPr>
                         <w:rPr>
                           <w:rFonts w:ascii="Times New Roman" w:hAnsi="Times New Roman" w:cs="Times New Roman"/>
-                          <w:lang w:val="fr-FR"/>
                         </w:rPr>
                       </w:pPr>
                       <w:r>
@@ -14843,7 +14841,6 @@
                       <w:r>
                         <w:rPr>
                           <w:rFonts w:ascii="Times New Roman" w:hAnsi="Times New Roman" w:cs="Times New Roman"/>
-                          <w:lang w:val="fr-FR"/>
                         </w:rPr>
                         <w:t xml:space="preserve">ma_ve INT NOT NULL </w:t>
                       </w:r>
@@ -14856,7 +14853,6 @@
                       <w:r>
                         <w:rPr>
                           <w:rFonts w:ascii="Times New Roman" w:hAnsi="Times New Roman" w:cs="Times New Roman"/>
-                          <w:lang w:val="fr-FR"/>
                         </w:rPr>
                         <w:t>,</w:t>
                       </w:r>
@@ -14865,13 +14861,11 @@
                       <w:pPr>
                         <w:rPr>
                           <w:rFonts w:ascii="Times New Roman" w:hAnsi="Times New Roman" w:cs="Times New Roman"/>
-                          <w:lang w:val="fr-FR"/>
-                        </w:rPr>
-                      </w:pPr>
-                      <w:r>
-                        <w:rPr>
-                          <w:rFonts w:ascii="Times New Roman" w:hAnsi="Times New Roman" w:cs="Times New Roman"/>
-                          <w:lang w:val="fr-FR"/>
+                        </w:rPr>
+                      </w:pPr>
+                      <w:r>
+                        <w:rPr>
+                          <w:rFonts w:ascii="Times New Roman" w:hAnsi="Times New Roman" w:cs="Times New Roman"/>
                         </w:rPr>
                         <w:t xml:space="preserve">    ma_suat_chieu INT NOT NULL,</w:t>
                       </w:r>
@@ -14885,7 +14879,6 @@
                       <w:r>
                         <w:rPr>
                           <w:rFonts w:ascii="Times New Roman" w:hAnsi="Times New Roman" w:cs="Times New Roman"/>
-                          <w:lang w:val="fr-FR"/>
                         </w:rPr>
                         <w:t xml:space="preserve">    </w:t>
                       </w:r>
@@ -15297,13 +15290,11 @@
                             <w:pPr>
                               <w:rPr>
                                 <w:rFonts w:ascii="Times New Roman" w:hAnsi="Times New Roman" w:cs="Times New Roman"/>
-                                <w:lang w:val="fr-FR"/>
-                              </w:rPr>
-                            </w:pPr>
-                            <w:r>
-                              <w:rPr>
-                                <w:rFonts w:ascii="Times New Roman" w:hAnsi="Times New Roman" w:cs="Times New Roman"/>
-                                <w:lang w:val="fr-FR"/>
+                              </w:rPr>
+                            </w:pPr>
+                            <w:r>
+                              <w:rPr>
+                                <w:rFonts w:ascii="Times New Roman" w:hAnsi="Times New Roman" w:cs="Times New Roman"/>
                               </w:rPr>
                               <w:t xml:space="preserve">    ma_suat_chieu INT NOT NULL,</w:t>
                             </w:r>
@@ -15317,7 +15308,6 @@
                             <w:r>
                               <w:rPr>
                                 <w:rFonts w:ascii="Times New Roman" w:hAnsi="Times New Roman" w:cs="Times New Roman"/>
-                                <w:lang w:val="fr-FR"/>
                               </w:rPr>
                               <w:t xml:space="preserve">    </w:t>
                             </w:r>
@@ -15635,13 +15625,11 @@
                       <w:pPr>
                         <w:rPr>
                           <w:rFonts w:ascii="Times New Roman" w:hAnsi="Times New Roman" w:cs="Times New Roman"/>
-                          <w:lang w:val="fr-FR"/>
-                        </w:rPr>
-                      </w:pPr>
-                      <w:r>
-                        <w:rPr>
-                          <w:rFonts w:ascii="Times New Roman" w:hAnsi="Times New Roman" w:cs="Times New Roman"/>
-                          <w:lang w:val="fr-FR"/>
+                        </w:rPr>
+                      </w:pPr>
+                      <w:r>
+                        <w:rPr>
+                          <w:rFonts w:ascii="Times New Roman" w:hAnsi="Times New Roman" w:cs="Times New Roman"/>
                         </w:rPr>
                         <w:t xml:space="preserve">    ma_suat_chieu INT NOT NULL,</w:t>
                       </w:r>
@@ -15655,7 +15643,6 @@
                       <w:r>
                         <w:rPr>
                           <w:rFonts w:ascii="Times New Roman" w:hAnsi="Times New Roman" w:cs="Times New Roman"/>
-                          <w:lang w:val="fr-FR"/>
                         </w:rPr>
                         <w:t xml:space="preserve">    </w:t>
                       </w:r>
@@ -23533,8 +23520,51 @@
         </w:rPr>
       </w:pPr>
     </w:p>
+    <w:p>
+      <w:pPr>
+        <w:rPr>
+          <w:rFonts w:ascii="Times New Roman" w:hAnsi="Times New Roman" w:cs="Times New Roman"/>
+        </w:rPr>
+      </w:pPr>
+    </w:p>
+    <w:p>
+      <w:pPr>
+        <w:rPr>
+          <w:rFonts w:ascii="Times New Roman" w:hAnsi="Times New Roman" w:cs="Times New Roman"/>
+        </w:rPr>
+      </w:pPr>
+      <w:r>
+        <w:rPr>
+          <w:rFonts w:ascii="Times New Roman" w:hAnsi="Times New Roman" w:cs="Times New Roman"/>
+        </w:rPr>
+        <w:t xml:space="preserve">Đường dẫn githup Code SQL+ Web: </w:t>
+      </w:r>
+      <w:hyperlink r:id="rId30" w:history="1">
+        <w:r>
+          <w:rPr>
+            <w:rStyle w:val="Hyperlink"/>
+            <w:rFonts w:ascii="Times New Roman" w:hAnsi="Times New Roman" w:cs="Times New Roman"/>
+          </w:rPr>
+          <w:t>https://github.com/dongkaiza2004-ui/CSDL</w:t>
+        </w:r>
+      </w:hyperlink>
+    </w:p>
+    <w:p>
+      <w:pPr>
+        <w:rPr>
+          <w:rFonts w:ascii="Times New Roman" w:hAnsi="Times New Roman" w:cs="Times New Roman"/>
+        </w:rPr>
+      </w:pPr>
+    </w:p>
+    <w:p>
+      <w:pPr>
+        <w:rPr>
+          <w:rFonts w:ascii="Times New Roman" w:hAnsi="Times New Roman" w:cs="Times New Roman"/>
+        </w:rPr>
+      </w:pPr>
+    </w:p>
     <w:sectPr>
-      <w:footerReference w:type="default" r:id="rId30"/>
+      <w:footerReference w:type="default" r:id="rId31"/>
       <w:pgSz w:w="12240" w:h="15840"/>
       <w:pgMar w:top="1440" w:right="1440" w:bottom="1440" w:left="1440" w:header="720" w:footer="720" w:gutter="0"/>
       <w:cols w:space="720"/>
@@ -28741,6 +28771,18 @@
       <w14:ligatures w14:val="none"/>
     </w:rPr>
   </w:style>
+  <w:style w:type="character" w:styleId="UnresolvedMention">
+    <w:name w:val="Unresolved Mention"/>
+    <w:basedOn w:val="DefaultParagraphFont"/>
+    <w:uiPriority w:val="99"/>
+    <w:semiHidden/>
+    <w:unhideWhenUsed/>
+    <w:rsid w:val="003C7357"/>
+    <w:rPr>
+      <w:color w:val="605E5C"/>
+      <w:shd w:val="clear" w:color="auto" w:fill="E1DFDD"/>
+    </w:rPr>
+  </w:style>
 </w:styles>
 </file>
 

</xml_diff>

<commit_message>
sửa lỗi trigger update
</commit_message>
<xml_diff>
--- a/CSDL.docx
+++ b/CSDL.docx
@@ -27,7 +27,7 @@
         <mc:AlternateContent>
           <mc:Choice Requires="wpg">
             <w:drawing>
-              <wp:anchor distT="0" distB="0" distL="114300" distR="114300" simplePos="0" relativeHeight="251676672" behindDoc="0" locked="0" layoutInCell="1" allowOverlap="1" wp14:anchorId="11946D24" wp14:editId="01C61FA7">
+              <wp:anchor distT="0" distB="0" distL="114300" distR="114300" simplePos="0" relativeHeight="251676672" behindDoc="0" locked="0" layoutInCell="1" allowOverlap="1" wp14:anchorId="11946D24" wp14:editId="1FDA6540">
                 <wp:simplePos x="0" y="0"/>
                 <wp:positionH relativeFrom="column">
                   <wp:posOffset>-381000</wp:posOffset>
@@ -116,14 +116,14 @@
                           </a:ln>
                           <a:extLst>
                             <a:ext uri="{909E8E84-426E-40dd-AFC4-6F175D3DCCD1}">
-                              <a14:hiddenFill xmlns="" xmlns:mo="http://schemas.microsoft.com/office/mac/office/2008/main" xmlns:mv="urn:schemas-microsoft-com:mac:vml" xmlns:o="urn:schemas-microsoft-com:office:office" xmlns:v="urn:schemas-microsoft-com:vml" xmlns:w10="urn:schemas-microsoft-com:office:word" xmlns:w="http://schemas.openxmlformats.org/wordprocessingml/2006/main" xmlns:a14="http://schemas.microsoft.com/office/drawing/2010/main" xmlns:lc="http://schemas.openxmlformats.org/drawingml/2006/lockedCanvas">
+                              <a14:hiddenFill xmlns:lc="http://schemas.openxmlformats.org/drawingml/2006/lockedCanvas" xmlns:a14="http://schemas.microsoft.com/office/drawing/2010/main" xmlns:w="http://schemas.openxmlformats.org/wordprocessingml/2006/main" xmlns:w10="urn:schemas-microsoft-com:office:word" xmlns:v="urn:schemas-microsoft-com:vml" xmlns:o="urn:schemas-microsoft-com:office:office" xmlns:mv="urn:schemas-microsoft-com:mac:vml" xmlns:mo="http://schemas.microsoft.com/office/mac/office/2008/main" xmlns="">
                                 <a:solidFill>
                                   <a:srgbClr val="FFFFFF"/>
                                 </a:solidFill>
                               </a14:hiddenFill>
                             </a:ext>
                             <a:ext uri="{91240B29-F687-4f45-9708-019B960494DF}">
-                              <a14:hiddenLine xmlns="" xmlns:mo="http://schemas.microsoft.com/office/mac/office/2008/main" xmlns:mv="urn:schemas-microsoft-com:mac:vml" xmlns:o="urn:schemas-microsoft-com:office:office" xmlns:v="urn:schemas-microsoft-com:vml" xmlns:w10="urn:schemas-microsoft-com:office:word" xmlns:w="http://schemas.openxmlformats.org/wordprocessingml/2006/main" xmlns:a14="http://schemas.microsoft.com/office/drawing/2010/main" xmlns:lc="http://schemas.openxmlformats.org/drawingml/2006/lockedCanvas" w="9525">
+                              <a14:hiddenLine xmlns:lc="http://schemas.openxmlformats.org/drawingml/2006/lockedCanvas" xmlns:a14="http://schemas.microsoft.com/office/drawing/2010/main" xmlns:w="http://schemas.openxmlformats.org/wordprocessingml/2006/main" xmlns:w10="urn:schemas-microsoft-com:office:word" xmlns:v="urn:schemas-microsoft-com:vml" xmlns:o="urn:schemas-microsoft-com:office:office" xmlns:mv="urn:schemas-microsoft-com:mac:vml" xmlns:mo="http://schemas.microsoft.com/office/mac/office/2008/main" xmlns="" w="9525">
                                 <a:solidFill>
                                   <a:srgbClr val="000000"/>
                                 </a:solidFill>
@@ -231,14 +231,14 @@
                           </a:ln>
                           <a:extLst>
                             <a:ext uri="{909E8E84-426E-40dd-AFC4-6F175D3DCCD1}">
-                              <a14:hiddenFill xmlns="" xmlns:mo="http://schemas.microsoft.com/office/mac/office/2008/main" xmlns:mv="urn:schemas-microsoft-com:mac:vml" xmlns:o="urn:schemas-microsoft-com:office:office" xmlns:v="urn:schemas-microsoft-com:vml" xmlns:w10="urn:schemas-microsoft-com:office:word" xmlns:w="http://schemas.openxmlformats.org/wordprocessingml/2006/main" xmlns:a14="http://schemas.microsoft.com/office/drawing/2010/main" xmlns:lc="http://schemas.openxmlformats.org/drawingml/2006/lockedCanvas">
+                              <a14:hiddenFill xmlns:lc="http://schemas.openxmlformats.org/drawingml/2006/lockedCanvas" xmlns:a14="http://schemas.microsoft.com/office/drawing/2010/main" xmlns:w="http://schemas.openxmlformats.org/wordprocessingml/2006/main" xmlns:w10="urn:schemas-microsoft-com:office:word" xmlns:v="urn:schemas-microsoft-com:vml" xmlns:o="urn:schemas-microsoft-com:office:office" xmlns:mv="urn:schemas-microsoft-com:mac:vml" xmlns:mo="http://schemas.microsoft.com/office/mac/office/2008/main" xmlns="">
                                 <a:solidFill>
                                   <a:srgbClr val="FFFFFF"/>
                                 </a:solidFill>
                               </a14:hiddenFill>
                             </a:ext>
                             <a:ext uri="{91240B29-F687-4f45-9708-019B960494DF}">
-                              <a14:hiddenLine xmlns="" xmlns:mo="http://schemas.microsoft.com/office/mac/office/2008/main" xmlns:mv="urn:schemas-microsoft-com:mac:vml" xmlns:o="urn:schemas-microsoft-com:office:office" xmlns:v="urn:schemas-microsoft-com:vml" xmlns:w10="urn:schemas-microsoft-com:office:word" xmlns:w="http://schemas.openxmlformats.org/wordprocessingml/2006/main" xmlns:a14="http://schemas.microsoft.com/office/drawing/2010/main" xmlns:lc="http://schemas.openxmlformats.org/drawingml/2006/lockedCanvas" w="9525">
+                              <a14:hiddenLine xmlns:lc="http://schemas.openxmlformats.org/drawingml/2006/lockedCanvas" xmlns:a14="http://schemas.microsoft.com/office/drawing/2010/main" xmlns:w="http://schemas.openxmlformats.org/wordprocessingml/2006/main" xmlns:w10="urn:schemas-microsoft-com:office:word" xmlns:v="urn:schemas-microsoft-com:vml" xmlns:o="urn:schemas-microsoft-com:office:office" xmlns:mv="urn:schemas-microsoft-com:mac:vml" xmlns:mo="http://schemas.microsoft.com/office/mac/office/2008/main" xmlns="" w="9525">
                                 <a:solidFill>
                                   <a:srgbClr val="000000"/>
                                 </a:solidFill>
@@ -284,14 +284,14 @@
                           </a:ln>
                           <a:extLst>
                             <a:ext uri="{909E8E84-426E-40dd-AFC4-6F175D3DCCD1}">
-                              <a14:hiddenFill xmlns="" xmlns:mo="http://schemas.microsoft.com/office/mac/office/2008/main" xmlns:mv="urn:schemas-microsoft-com:mac:vml" xmlns:o="urn:schemas-microsoft-com:office:office" xmlns:v="urn:schemas-microsoft-com:vml" xmlns:w10="urn:schemas-microsoft-com:office:word" xmlns:w="http://schemas.openxmlformats.org/wordprocessingml/2006/main" xmlns:a14="http://schemas.microsoft.com/office/drawing/2010/main" xmlns:lc="http://schemas.openxmlformats.org/drawingml/2006/lockedCanvas">
+                              <a14:hiddenFill xmlns:lc="http://schemas.openxmlformats.org/drawingml/2006/lockedCanvas" xmlns:a14="http://schemas.microsoft.com/office/drawing/2010/main" xmlns:w="http://schemas.openxmlformats.org/wordprocessingml/2006/main" xmlns:w10="urn:schemas-microsoft-com:office:word" xmlns:v="urn:schemas-microsoft-com:vml" xmlns:o="urn:schemas-microsoft-com:office:office" xmlns:mv="urn:schemas-microsoft-com:mac:vml" xmlns:mo="http://schemas.microsoft.com/office/mac/office/2008/main" xmlns="">
                                 <a:solidFill>
                                   <a:srgbClr val="FFFFFF"/>
                                 </a:solidFill>
                               </a14:hiddenFill>
                             </a:ext>
                             <a:ext uri="{91240B29-F687-4f45-9708-019B960494DF}">
-                              <a14:hiddenLine xmlns="" xmlns:mo="http://schemas.microsoft.com/office/mac/office/2008/main" xmlns:mv="urn:schemas-microsoft-com:mac:vml" xmlns:o="urn:schemas-microsoft-com:office:office" xmlns:v="urn:schemas-microsoft-com:vml" xmlns:w10="urn:schemas-microsoft-com:office:word" xmlns:w="http://schemas.openxmlformats.org/wordprocessingml/2006/main" xmlns:a14="http://schemas.microsoft.com/office/drawing/2010/main" xmlns:lc="http://schemas.openxmlformats.org/drawingml/2006/lockedCanvas" w="9525">
+                              <a14:hiddenLine xmlns:lc="http://schemas.openxmlformats.org/drawingml/2006/lockedCanvas" xmlns:a14="http://schemas.microsoft.com/office/drawing/2010/main" xmlns:w="http://schemas.openxmlformats.org/wordprocessingml/2006/main" xmlns:w10="urn:schemas-microsoft-com:office:word" xmlns:v="urn:schemas-microsoft-com:vml" xmlns:o="urn:schemas-microsoft-com:office:office" xmlns:mv="urn:schemas-microsoft-com:mac:vml" xmlns:mo="http://schemas.microsoft.com/office/mac/office/2008/main" xmlns="" w="9525">
                                 <a:solidFill>
                                   <a:srgbClr val="000000"/>
                                 </a:solidFill>
@@ -363,14 +363,14 @@
                           </a:ln>
                           <a:extLst>
                             <a:ext uri="{909E8E84-426E-40dd-AFC4-6F175D3DCCD1}">
-                              <a14:hiddenFill xmlns="" xmlns:mo="http://schemas.microsoft.com/office/mac/office/2008/main" xmlns:mv="urn:schemas-microsoft-com:mac:vml" xmlns:o="urn:schemas-microsoft-com:office:office" xmlns:v="urn:schemas-microsoft-com:vml" xmlns:w10="urn:schemas-microsoft-com:office:word" xmlns:w="http://schemas.openxmlformats.org/wordprocessingml/2006/main" xmlns:a14="http://schemas.microsoft.com/office/drawing/2010/main" xmlns:lc="http://schemas.openxmlformats.org/drawingml/2006/lockedCanvas">
+                              <a14:hiddenFill xmlns:lc="http://schemas.openxmlformats.org/drawingml/2006/lockedCanvas" xmlns:a14="http://schemas.microsoft.com/office/drawing/2010/main" xmlns:w="http://schemas.openxmlformats.org/wordprocessingml/2006/main" xmlns:w10="urn:schemas-microsoft-com:office:word" xmlns:v="urn:schemas-microsoft-com:vml" xmlns:o="urn:schemas-microsoft-com:office:office" xmlns:mv="urn:schemas-microsoft-com:mac:vml" xmlns:mo="http://schemas.microsoft.com/office/mac/office/2008/main" xmlns="">
                                 <a:solidFill>
                                   <a:srgbClr val="FFFFFF"/>
                                 </a:solidFill>
                               </a14:hiddenFill>
                             </a:ext>
                             <a:ext uri="{91240B29-F687-4f45-9708-019B960494DF}">
-                              <a14:hiddenLine xmlns="" xmlns:mo="http://schemas.microsoft.com/office/mac/office/2008/main" xmlns:mv="urn:schemas-microsoft-com:mac:vml" xmlns:o="urn:schemas-microsoft-com:office:office" xmlns:v="urn:schemas-microsoft-com:vml" xmlns:w10="urn:schemas-microsoft-com:office:word" xmlns:w="http://schemas.openxmlformats.org/wordprocessingml/2006/main" xmlns:a14="http://schemas.microsoft.com/office/drawing/2010/main" xmlns:lc="http://schemas.openxmlformats.org/drawingml/2006/lockedCanvas" w="9525">
+                              <a14:hiddenLine xmlns:lc="http://schemas.openxmlformats.org/drawingml/2006/lockedCanvas" xmlns:a14="http://schemas.microsoft.com/office/drawing/2010/main" xmlns:w="http://schemas.openxmlformats.org/wordprocessingml/2006/main" xmlns:w10="urn:schemas-microsoft-com:office:word" xmlns:v="urn:schemas-microsoft-com:vml" xmlns:o="urn:schemas-microsoft-com:office:office" xmlns:mv="urn:schemas-microsoft-com:mac:vml" xmlns:mo="http://schemas.microsoft.com/office/mac/office/2008/main" xmlns="" w="9525">
                                 <a:solidFill>
                                   <a:srgbClr val="000000"/>
                                 </a:solidFill>
@@ -404,7 +404,7 @@
                           </a:ln>
                           <a:extLst>
                             <a:ext uri="{909E8E84-426E-40dd-AFC4-6F175D3DCCD1}">
-                              <a14:hiddenFill xmlns="" xmlns:mo="http://schemas.microsoft.com/office/mac/office/2008/main" xmlns:mv="urn:schemas-microsoft-com:mac:vml" xmlns:o="urn:schemas-microsoft-com:office:office" xmlns:v="urn:schemas-microsoft-com:vml" xmlns:w10="urn:schemas-microsoft-com:office:word" xmlns:w="http://schemas.openxmlformats.org/wordprocessingml/2006/main" xmlns:a14="http://schemas.microsoft.com/office/drawing/2010/main" xmlns:lc="http://schemas.openxmlformats.org/drawingml/2006/lockedCanvas">
+                              <a14:hiddenFill xmlns:lc="http://schemas.openxmlformats.org/drawingml/2006/lockedCanvas" xmlns:a14="http://schemas.microsoft.com/office/drawing/2010/main" xmlns:w="http://schemas.openxmlformats.org/wordprocessingml/2006/main" xmlns:w10="urn:schemas-microsoft-com:office:word" xmlns:v="urn:schemas-microsoft-com:vml" xmlns:o="urn:schemas-microsoft-com:office:office" xmlns:mv="urn:schemas-microsoft-com:mac:vml" xmlns:mo="http://schemas.microsoft.com/office/mac/office/2008/main" xmlns="">
                                 <a:noFill/>
                               </a14:hiddenFill>
                             </a:ext>
@@ -434,7 +434,7 @@
                           </a:ln>
                           <a:extLst>
                             <a:ext uri="{909E8E84-426E-40dd-AFC4-6F175D3DCCD1}">
-                              <a14:hiddenFill xmlns="" xmlns:mo="http://schemas.microsoft.com/office/mac/office/2008/main" xmlns:mv="urn:schemas-microsoft-com:mac:vml" xmlns:o="urn:schemas-microsoft-com:office:office" xmlns:v="urn:schemas-microsoft-com:vml" xmlns:w10="urn:schemas-microsoft-com:office:word" xmlns:w="http://schemas.openxmlformats.org/wordprocessingml/2006/main" xmlns:a14="http://schemas.microsoft.com/office/drawing/2010/main" xmlns:lc="http://schemas.openxmlformats.org/drawingml/2006/lockedCanvas">
+                              <a14:hiddenFill xmlns:lc="http://schemas.openxmlformats.org/drawingml/2006/lockedCanvas" xmlns:a14="http://schemas.microsoft.com/office/drawing/2010/main" xmlns:w="http://schemas.openxmlformats.org/wordprocessingml/2006/main" xmlns:w10="urn:schemas-microsoft-com:office:word" xmlns:v="urn:schemas-microsoft-com:vml" xmlns:o="urn:schemas-microsoft-com:office:office" xmlns:mv="urn:schemas-microsoft-com:mac:vml" xmlns:mo="http://schemas.microsoft.com/office/mac/office/2008/main" xmlns="">
                                 <a:noFill/>
                               </a14:hiddenFill>
                             </a:ext>
@@ -464,7 +464,7 @@
                           </a:ln>
                           <a:extLst>
                             <a:ext uri="{909E8E84-426E-40dd-AFC4-6F175D3DCCD1}">
-                              <a14:hiddenFill xmlns="" xmlns:mo="http://schemas.microsoft.com/office/mac/office/2008/main" xmlns:mv="urn:schemas-microsoft-com:mac:vml" xmlns:o="urn:schemas-microsoft-com:office:office" xmlns:v="urn:schemas-microsoft-com:vml" xmlns:w10="urn:schemas-microsoft-com:office:word" xmlns:w="http://schemas.openxmlformats.org/wordprocessingml/2006/main" xmlns:a14="http://schemas.microsoft.com/office/drawing/2010/main" xmlns:lc="http://schemas.openxmlformats.org/drawingml/2006/lockedCanvas">
+                              <a14:hiddenFill xmlns:lc="http://schemas.openxmlformats.org/drawingml/2006/lockedCanvas" xmlns:a14="http://schemas.microsoft.com/office/drawing/2010/main" xmlns:w="http://schemas.openxmlformats.org/wordprocessingml/2006/main" xmlns:w10="urn:schemas-microsoft-com:office:word" xmlns:v="urn:schemas-microsoft-com:vml" xmlns:o="urn:schemas-microsoft-com:office:office" xmlns:mv="urn:schemas-microsoft-com:mac:vml" xmlns:mo="http://schemas.microsoft.com/office/mac/office/2008/main" xmlns="">
                                 <a:noFill/>
                               </a14:hiddenFill>
                             </a:ext>
@@ -494,7 +494,7 @@
                           </a:ln>
                           <a:extLst>
                             <a:ext uri="{909E8E84-426E-40dd-AFC4-6F175D3DCCD1}">
-                              <a14:hiddenFill xmlns="" xmlns:mo="http://schemas.microsoft.com/office/mac/office/2008/main" xmlns:mv="urn:schemas-microsoft-com:mac:vml" xmlns:o="urn:schemas-microsoft-com:office:office" xmlns:v="urn:schemas-microsoft-com:vml" xmlns:w10="urn:schemas-microsoft-com:office:word" xmlns:w="http://schemas.openxmlformats.org/wordprocessingml/2006/main" xmlns:a14="http://schemas.microsoft.com/office/drawing/2010/main" xmlns:lc="http://schemas.openxmlformats.org/drawingml/2006/lockedCanvas">
+                              <a14:hiddenFill xmlns:lc="http://schemas.openxmlformats.org/drawingml/2006/lockedCanvas" xmlns:a14="http://schemas.microsoft.com/office/drawing/2010/main" xmlns:w="http://schemas.openxmlformats.org/wordprocessingml/2006/main" xmlns:w10="urn:schemas-microsoft-com:office:word" xmlns:v="urn:schemas-microsoft-com:vml" xmlns:o="urn:schemas-microsoft-com:office:office" xmlns:mv="urn:schemas-microsoft-com:mac:vml" xmlns:mo="http://schemas.microsoft.com/office/mac/office/2008/main" xmlns="">
                                 <a:noFill/>
                               </a14:hiddenFill>
                             </a:ext>
@@ -779,18 +779,52 @@
           <w:rFonts w:ascii="Times New Roman" w:hAnsi="Times New Roman" w:cs="Times New Roman"/>
           <w:b/>
           <w:bCs/>
-          <w:noProof/>
           <w:sz w:val="28"/>
           <w:szCs w:val="28"/>
         </w:rPr>
+        <w:t>ĐỀ BÀI :</w:t>
+      </w:r>
+      <w:r>
+        <w:rPr>
+          <w:rFonts w:ascii="Times New Roman" w:hAnsi="Times New Roman" w:cs="Times New Roman"/>
+          <w:b/>
+          <w:bCs/>
+          <w:sz w:val="28"/>
+          <w:szCs w:val="28"/>
+        </w:rPr>
+        <w:t xml:space="preserve"> XÂY DỰNG CƠ SỞ DỮ LIỆU QUẢN LÝ RẠP CHIẾU PHIM</w:t>
+      </w:r>
+    </w:p>
+    <w:p>
+      <w:pPr>
+        <w:tabs>
+          <w:tab w:val="left" w:leader="dot" w:pos="8789"/>
+        </w:tabs>
+        <w:spacing w:line="312" w:lineRule="auto"/>
+        <w:jc w:val="center"/>
+        <w:rPr>
+          <w:b/>
+          <w:bCs/>
+          <w:sz w:val="28"/>
+          <w:szCs w:val="28"/>
+        </w:rPr>
+      </w:pPr>
+      <w:r>
+        <w:rPr>
+          <w:rFonts w:ascii="Times New Roman" w:hAnsi="Times New Roman" w:cs="Times New Roman"/>
+          <w:b/>
+          <w:bCs/>
+          <w:sz w:val="28"/>
+          <w:szCs w:val="28"/>
+        </w:rPr>
         <w:drawing>
-          <wp:anchor distT="0" distB="0" distL="114300" distR="114300" simplePos="0" relativeHeight="251677696" behindDoc="1" locked="0" layoutInCell="1" allowOverlap="1" wp14:anchorId="00123A0D" wp14:editId="5649B2A7">
+          <wp:anchor distT="0" distB="0" distL="114300" distR="114300" simplePos="0" relativeHeight="251677696" behindDoc="1" locked="0" layoutInCell="1" allowOverlap="1" wp14:anchorId="00123A0D" wp14:editId="6E3FC7A1">
             <wp:simplePos x="0" y="0"/>
             <wp:positionH relativeFrom="column">
               <wp:posOffset>1692910</wp:posOffset>
             </wp:positionH>
             <wp:positionV relativeFrom="paragraph">
-              <wp:posOffset>229870</wp:posOffset>
+              <wp:posOffset>31961</wp:posOffset>
             </wp:positionV>
             <wp:extent cx="2640965" cy="2040890"/>
             <wp:effectExtent l="0" t="0" r="0" b="0"/>
@@ -843,36 +877,6 @@
           </wp:anchor>
         </w:drawing>
       </w:r>
-      <w:r>
-        <w:rPr>
-          <w:rFonts w:ascii="Times New Roman" w:hAnsi="Times New Roman" w:cs="Times New Roman"/>
-          <w:b/>
-          <w:bCs/>
-          <w:sz w:val="28"/>
-          <w:szCs w:val="28"/>
-        </w:rPr>
-        <w:t>ĐỀ BÀI :</w:t>
-      </w:r>
-      <w:r>
-        <w:rPr>
-          <w:rFonts w:ascii="Times New Roman" w:hAnsi="Times New Roman" w:cs="Times New Roman"/>
-          <w:b/>
-          <w:color w:val="000000" w:themeColor="text1"/>
-          <w:sz w:val="28"/>
-          <w:szCs w:val="28"/>
-          <w14:shadow w14:blurRad="38100" w14:dist="19050" w14:dir="2700000" w14:sx="100000" w14:sy="100000" w14:kx="0" w14:ky="0" w14:algn="tl">
-            <w14:schemeClr w14:val="dk1">
-              <w14:alpha w14:val="60000"/>
-            </w14:schemeClr>
-          </w14:shadow>
-          <w14:textOutline w14:w="0" w14:cap="flat" w14:cmpd="sng" w14:algn="ctr">
-            <w14:noFill/>
-            <w14:prstDash w14:val="solid"/>
-            <w14:round/>
-          </w14:textOutline>
-        </w:rPr>
-        <w:t xml:space="preserve"> XÂY DỰNG CƠ SỞ DỮ LIỆU QUẢN LÝ RẠP CHIẾU PHIM</w:t>
-      </w:r>
     </w:p>
     <w:p>
       <w:pPr>
@@ -910,7 +914,6 @@
           <w:tab w:val="left" w:leader="dot" w:pos="8789"/>
         </w:tabs>
         <w:spacing w:line="312" w:lineRule="auto"/>
-        <w:jc w:val="center"/>
         <w:rPr>
           <w:b/>
           <w:bCs/>
@@ -932,6 +935,15 @@
           <w:szCs w:val="28"/>
         </w:rPr>
       </w:pPr>
+      <w:r>
+        <w:rPr>
+          <w:b/>
+          <w:bCs/>
+          <w:sz w:val="28"/>
+          <w:szCs w:val="28"/>
+        </w:rPr>
+        <w:t xml:space="preserve">                       </w:t>
+      </w:r>
     </w:p>
     <w:p>
       <w:pPr>
@@ -946,15 +958,6 @@
           <w:szCs w:val="28"/>
         </w:rPr>
       </w:pPr>
-      <w:r>
-        <w:rPr>
-          <w:b/>
-          <w:bCs/>
-          <w:sz w:val="28"/>
-          <w:szCs w:val="28"/>
-        </w:rPr>
-        <w:t xml:space="preserve">                        </w:t>
-      </w:r>
     </w:p>
     <w:tbl>
       <w:tblPr>
@@ -1237,29 +1240,6 @@
           <w:szCs w:val="28"/>
         </w:rPr>
       </w:pPr>
-    </w:p>
-    <w:p>
-      <w:pPr>
-        <w:tabs>
-          <w:tab w:val="left" w:leader="dot" w:pos="8789"/>
-        </w:tabs>
-        <w:spacing w:line="312" w:lineRule="auto"/>
-        <w:rPr>
-          <w:b/>
-          <w:bCs/>
-          <w:sz w:val="28"/>
-          <w:szCs w:val="28"/>
-        </w:rPr>
-      </w:pPr>
-      <w:r>
-        <w:rPr>
-          <w:b/>
-          <w:bCs/>
-          <w:sz w:val="28"/>
-          <w:szCs w:val="28"/>
-        </w:rPr>
-        <w:t xml:space="preserve">                                   </w:t>
-      </w:r>
     </w:p>
     <w:p>
       <w:pPr>
@@ -1438,7 +1418,7 @@
           <w:r>
             <w:fldChar w:fldCharType="separate"/>
           </w:r>
-          <w:hyperlink w:anchor="_Toc227057586" w:history="1">
+          <w:hyperlink w:anchor="_Toc227193407" w:history="1">
             <w:r>
               <w:rPr>
                 <w:rStyle w:val="Hyperlink"/>
@@ -1477,7 +1457,7 @@
                 <w:noProof/>
                 <w:webHidden/>
               </w:rPr>
-              <w:instrText xml:space="preserve"> PAGEREF _Toc227057586 \h </w:instrText>
+              <w:instrText xml:space="preserve"> PAGEREF _Toc227193407 \h </w:instrText>
             </w:r>
             <w:r>
               <w:rPr>
@@ -1520,7 +1500,7 @@
               <w:noProof/>
             </w:rPr>
           </w:pPr>
-          <w:hyperlink w:anchor="_Toc227057587" w:history="1">
+          <w:hyperlink w:anchor="_Toc227193408" w:history="1">
             <w:r>
               <w:rPr>
                 <w:rStyle w:val="Hyperlink"/>
@@ -1567,7 +1547,7 @@
                 <w:noProof/>
                 <w:webHidden/>
               </w:rPr>
-              <w:instrText xml:space="preserve"> PAGEREF _Toc227057587 \h </w:instrText>
+              <w:instrText xml:space="preserve"> PAGEREF _Toc227193408 \h </w:instrText>
             </w:r>
             <w:r>
               <w:rPr>
@@ -1610,7 +1590,7 @@
               <w:noProof/>
             </w:rPr>
           </w:pPr>
-          <w:hyperlink w:anchor="_Toc227057588" w:history="1">
+          <w:hyperlink w:anchor="_Toc227193409" w:history="1">
             <w:r>
               <w:rPr>
                 <w:rStyle w:val="Hyperlink"/>
@@ -1657,7 +1637,7 @@
                 <w:noProof/>
                 <w:webHidden/>
               </w:rPr>
-              <w:instrText xml:space="preserve"> PAGEREF _Toc227057588 \h </w:instrText>
+              <w:instrText xml:space="preserve"> PAGEREF _Toc227193409 \h </w:instrText>
             </w:r>
             <w:r>
               <w:rPr>
@@ -1700,7 +1680,7 @@
               <w:noProof/>
             </w:rPr>
           </w:pPr>
-          <w:hyperlink w:anchor="_Toc227057589" w:history="1">
+          <w:hyperlink w:anchor="_Toc227193410" w:history="1">
             <w:r>
               <w:rPr>
                 <w:rStyle w:val="Hyperlink"/>
@@ -1747,7 +1727,7 @@
                 <w:noProof/>
                 <w:webHidden/>
               </w:rPr>
-              <w:instrText xml:space="preserve"> PAGEREF _Toc227057589 \h </w:instrText>
+              <w:instrText xml:space="preserve"> PAGEREF _Toc227193410 \h </w:instrText>
             </w:r>
             <w:r>
               <w:rPr>
@@ -1790,7 +1770,7 @@
               <w:noProof/>
             </w:rPr>
           </w:pPr>
-          <w:hyperlink w:anchor="_Toc227057590" w:history="1">
+          <w:hyperlink w:anchor="_Toc227193411" w:history="1">
             <w:r>
               <w:rPr>
                 <w:rStyle w:val="Hyperlink"/>
@@ -1837,7 +1817,7 @@
                 <w:noProof/>
                 <w:webHidden/>
               </w:rPr>
-              <w:instrText xml:space="preserve"> PAGEREF _Toc227057590 \h </w:instrText>
+              <w:instrText xml:space="preserve"> PAGEREF _Toc227193411 \h </w:instrText>
             </w:r>
             <w:r>
               <w:rPr>
@@ -1880,7 +1860,7 @@
               <w:noProof/>
             </w:rPr>
           </w:pPr>
-          <w:hyperlink w:anchor="_Toc227057591" w:history="1">
+          <w:hyperlink w:anchor="_Toc227193412" w:history="1">
             <w:r>
               <w:rPr>
                 <w:rStyle w:val="Hyperlink"/>
@@ -1927,93 +1907,7 @@
                 <w:noProof/>
                 <w:webHidden/>
               </w:rPr>
-              <w:instrText xml:space="preserve"> PAGEREF _Toc227057591 \h </w:instrText>
-            </w:r>
-            <w:r>
-              <w:rPr>
-                <w:noProof/>
-                <w:webHidden/>
-              </w:rPr>
-            </w:r>
-            <w:r>
-              <w:rPr>
-                <w:noProof/>
-                <w:webHidden/>
-              </w:rPr>
-              <w:fldChar w:fldCharType="separate"/>
-            </w:r>
-            <w:r>
-              <w:rPr>
-                <w:noProof/>
-                <w:webHidden/>
-              </w:rPr>
-              <w:t>5</w:t>
-            </w:r>
-            <w:r>
-              <w:rPr>
-                <w:noProof/>
-                <w:webHidden/>
-              </w:rPr>
-              <w:fldChar w:fldCharType="end"/>
-            </w:r>
-          </w:hyperlink>
-        </w:p>
-        <w:p>
-          <w:pPr>
-            <w:pStyle w:val="TOC2"/>
-            <w:tabs>
-              <w:tab w:val="left" w:pos="720"/>
-              <w:tab w:val="right" w:leader="dot" w:pos="9350"/>
-            </w:tabs>
-            <w:rPr>
-              <w:rFonts w:eastAsiaTheme="minorEastAsia"/>
-              <w:noProof/>
-            </w:rPr>
-          </w:pPr>
-          <w:hyperlink w:anchor="_Toc227057592" w:history="1">
-            <w:r>
-              <w:rPr>
-                <w:rStyle w:val="Hyperlink"/>
-                <w:rFonts w:ascii="Symbol" w:hAnsi="Symbol" w:cs="Times New Roman"/>
-                <w:noProof/>
-              </w:rPr>
-              <w:t></w:t>
-            </w:r>
-            <w:r>
-              <w:rPr>
-                <w:rFonts w:eastAsiaTheme="minorEastAsia"/>
-                <w:noProof/>
-              </w:rPr>
-              <w:tab/>
-            </w:r>
-            <w:r>
-              <w:rPr>
-                <w:rStyle w:val="Hyperlink"/>
-                <w:rFonts w:ascii="Times New Roman" w:hAnsi="Times New Roman" w:cs="Times New Roman"/>
-                <w:noProof/>
-              </w:rPr>
-              <w:t>Mỗi bộ phim có thời lượng tối thiểu là 60 phút và tối đa là 210 phút</w:t>
-            </w:r>
-            <w:r>
-              <w:rPr>
-                <w:noProof/>
-                <w:webHidden/>
-              </w:rPr>
-              <w:tab/>
-            </w:r>
-            <w:r>
-              <w:rPr>
-                <w:noProof/>
-                <w:webHidden/>
-              </w:rPr>
-              <w:fldChar w:fldCharType="begin"/>
-            </w:r>
-            <w:r>
-              <w:rPr>
-                <w:noProof/>
-                <w:webHidden/>
-              </w:rPr>
-              <w:instrText xml:space="preserve"> PAGEREF _Toc227057592 \h </w:instrText>
+              <w:instrText xml:space="preserve"> PAGEREF _Toc227193412 \h </w:instrText>
             </w:r>
             <w:r>
               <w:rPr>
@@ -2056,7 +1950,7 @@
               <w:noProof/>
             </w:rPr>
           </w:pPr>
-          <w:hyperlink w:anchor="_Toc227057593" w:history="1">
+          <w:hyperlink w:anchor="_Toc227193413" w:history="1">
             <w:r>
               <w:rPr>
                 <w:rStyle w:val="Hyperlink"/>
@@ -2103,7 +1997,7 @@
                 <w:noProof/>
                 <w:webHidden/>
               </w:rPr>
-              <w:instrText xml:space="preserve"> PAGEREF _Toc227057593 \h </w:instrText>
+              <w:instrText xml:space="preserve"> PAGEREF _Toc227193413 \h </w:instrText>
             </w:r>
             <w:r>
               <w:rPr>
@@ -2146,7 +2040,7 @@
               <w:noProof/>
             </w:rPr>
           </w:pPr>
-          <w:hyperlink w:anchor="_Toc227057594" w:history="1">
+          <w:hyperlink w:anchor="_Toc227193414" w:history="1">
             <w:r>
               <w:rPr>
                 <w:rStyle w:val="Hyperlink"/>
@@ -2193,7 +2087,7 @@
                 <w:noProof/>
                 <w:webHidden/>
               </w:rPr>
-              <w:instrText xml:space="preserve"> PAGEREF _Toc227057594 \h </w:instrText>
+              <w:instrText xml:space="preserve"> PAGEREF _Toc227193414 \h </w:instrText>
             </w:r>
             <w:r>
               <w:rPr>
@@ -2236,7 +2130,7 @@
               <w:noProof/>
             </w:rPr>
           </w:pPr>
-          <w:hyperlink w:anchor="_Toc227057595" w:history="1">
+          <w:hyperlink w:anchor="_Toc227193415" w:history="1">
             <w:r>
               <w:rPr>
                 <w:rStyle w:val="Hyperlink"/>
@@ -2283,7 +2177,7 @@
                 <w:noProof/>
                 <w:webHidden/>
               </w:rPr>
-              <w:instrText xml:space="preserve"> PAGEREF _Toc227057595 \h </w:instrText>
+              <w:instrText xml:space="preserve"> PAGEREF _Toc227193415 \h </w:instrText>
             </w:r>
             <w:r>
               <w:rPr>
@@ -2326,7 +2220,7 @@
               <w:noProof/>
             </w:rPr>
           </w:pPr>
-          <w:hyperlink w:anchor="_Toc227057596" w:history="1">
+          <w:hyperlink w:anchor="_Toc227193416" w:history="1">
             <w:r>
               <w:rPr>
                 <w:rStyle w:val="Hyperlink"/>
@@ -2373,7 +2267,7 @@
                 <w:noProof/>
                 <w:webHidden/>
               </w:rPr>
-              <w:instrText xml:space="preserve"> PAGEREF _Toc227057596 \h </w:instrText>
+              <w:instrText xml:space="preserve"> PAGEREF _Toc227193416 \h </w:instrText>
             </w:r>
             <w:r>
               <w:rPr>
@@ -2416,7 +2310,7 @@
               <w:noProof/>
             </w:rPr>
           </w:pPr>
-          <w:hyperlink w:anchor="_Toc227057597" w:history="1">
+          <w:hyperlink w:anchor="_Toc227193417" w:history="1">
             <w:r>
               <w:rPr>
                 <w:rStyle w:val="Hyperlink"/>
@@ -2463,7 +2357,7 @@
                 <w:noProof/>
                 <w:webHidden/>
               </w:rPr>
-              <w:instrText xml:space="preserve"> PAGEREF _Toc227057597 \h </w:instrText>
+              <w:instrText xml:space="preserve"> PAGEREF _Toc227193417 \h </w:instrText>
             </w:r>
             <w:r>
               <w:rPr>
@@ -2506,7 +2400,7 @@
               <w:noProof/>
             </w:rPr>
           </w:pPr>
-          <w:hyperlink w:anchor="_Toc227057598" w:history="1">
+          <w:hyperlink w:anchor="_Toc227193418" w:history="1">
             <w:r>
               <w:rPr>
                 <w:rStyle w:val="Hyperlink"/>
@@ -2553,7 +2447,7 @@
                 <w:noProof/>
                 <w:webHidden/>
               </w:rPr>
-              <w:instrText xml:space="preserve"> PAGEREF _Toc227057598 \h </w:instrText>
+              <w:instrText xml:space="preserve"> PAGEREF _Toc227193418 \h </w:instrText>
             </w:r>
             <w:r>
               <w:rPr>
@@ -2596,7 +2490,7 @@
               <w:noProof/>
             </w:rPr>
           </w:pPr>
-          <w:hyperlink w:anchor="_Toc227057599" w:history="1">
+          <w:hyperlink w:anchor="_Toc227193419" w:history="1">
             <w:r>
               <w:rPr>
                 <w:rStyle w:val="Hyperlink"/>
@@ -2645,7 +2539,7 @@
                 <w:noProof/>
                 <w:webHidden/>
               </w:rPr>
-              <w:instrText xml:space="preserve"> PAGEREF _Toc227057599 \h </w:instrText>
+              <w:instrText xml:space="preserve"> PAGEREF _Toc227193419 \h </w:instrText>
             </w:r>
             <w:r>
               <w:rPr>
@@ -2688,7 +2582,7 @@
               <w:noProof/>
             </w:rPr>
           </w:pPr>
-          <w:hyperlink w:anchor="_Toc227057600" w:history="1">
+          <w:hyperlink w:anchor="_Toc227193420" w:history="1">
             <w:r>
               <w:rPr>
                 <w:rStyle w:val="Hyperlink"/>
@@ -2737,7 +2631,7 @@
                 <w:noProof/>
                 <w:webHidden/>
               </w:rPr>
-              <w:instrText xml:space="preserve"> PAGEREF _Toc227057600 \h </w:instrText>
+              <w:instrText xml:space="preserve"> PAGEREF _Toc227193420 \h </w:instrText>
             </w:r>
             <w:r>
               <w:rPr>
@@ -2780,7 +2674,7 @@
               <w:noProof/>
             </w:rPr>
           </w:pPr>
-          <w:hyperlink w:anchor="_Toc227057601" w:history="1">
+          <w:hyperlink w:anchor="_Toc227193421" w:history="1">
             <w:r>
               <w:rPr>
                 <w:rStyle w:val="Hyperlink"/>
@@ -2829,7 +2723,7 @@
                 <w:noProof/>
                 <w:webHidden/>
               </w:rPr>
-              <w:instrText xml:space="preserve"> PAGEREF _Toc227057601 \h </w:instrText>
+              <w:instrText xml:space="preserve"> PAGEREF _Toc227193421 \h </w:instrText>
             </w:r>
             <w:r>
               <w:rPr>
@@ -2872,7 +2766,7 @@
               <w:noProof/>
             </w:rPr>
           </w:pPr>
-          <w:hyperlink w:anchor="_Toc227057602" w:history="1">
+          <w:hyperlink w:anchor="_Toc227193422" w:history="1">
             <w:r>
               <w:rPr>
                 <w:rStyle w:val="Hyperlink"/>
@@ -2921,7 +2815,7 @@
                 <w:noProof/>
                 <w:webHidden/>
               </w:rPr>
-              <w:instrText xml:space="preserve"> PAGEREF _Toc227057602 \h </w:instrText>
+              <w:instrText xml:space="preserve"> PAGEREF _Toc227193422 \h </w:instrText>
             </w:r>
             <w:r>
               <w:rPr>
@@ -2964,7 +2858,7 @@
               <w:noProof/>
             </w:rPr>
           </w:pPr>
-          <w:hyperlink w:anchor="_Toc227057603" w:history="1">
+          <w:hyperlink w:anchor="_Toc227193423" w:history="1">
             <w:r>
               <w:rPr>
                 <w:rStyle w:val="Hyperlink"/>
@@ -3011,7 +2905,7 @@
                 <w:noProof/>
                 <w:webHidden/>
               </w:rPr>
-              <w:instrText xml:space="preserve"> PAGEREF _Toc227057603 \h </w:instrText>
+              <w:instrText xml:space="preserve"> PAGEREF _Toc227193423 \h </w:instrText>
             </w:r>
             <w:r>
               <w:rPr>
@@ -3053,7 +2947,7 @@
               <w:noProof/>
             </w:rPr>
           </w:pPr>
-          <w:hyperlink w:anchor="_Toc227057604" w:history="1">
+          <w:hyperlink w:anchor="_Toc227193424" w:history="1">
             <w:r>
               <w:rPr>
                 <w:rStyle w:val="Hyperlink"/>
@@ -3092,7 +2986,7 @@
                 <w:noProof/>
                 <w:webHidden/>
               </w:rPr>
-              <w:instrText xml:space="preserve"> PAGEREF _Toc227057604 \h </w:instrText>
+              <w:instrText xml:space="preserve"> PAGEREF _Toc227193424 \h </w:instrText>
             </w:r>
             <w:r>
               <w:rPr>
@@ -3135,6 +3029,14 @@
         </w:p>
       </w:sdtContent>
     </w:sdt>
+    <w:p>
+      <w:pPr>
+        <w:spacing w:line="360" w:lineRule="auto"/>
+        <w:rPr>
+          <w:rFonts w:ascii="Times New Roman" w:hAnsi="Times New Roman" w:cs="Times New Roman"/>
+        </w:rPr>
+      </w:pPr>
+    </w:p>
     <w:p>
       <w:pPr>
         <w:spacing w:line="360" w:lineRule="auto"/>
@@ -3267,7 +3169,7 @@
         </w:rPr>
         <w:fldChar w:fldCharType="separate"/>
       </w:r>
-      <w:hyperlink w:anchor="_Toc227057605" w:history="1">
+      <w:hyperlink w:anchor="_Toc227193425" w:history="1">
         <w:r>
           <w:rPr>
             <w:rStyle w:val="Hyperlink"/>
@@ -3295,7 +3197,7 @@
             <w:noProof/>
             <w:webHidden/>
           </w:rPr>
-          <w:instrText xml:space="preserve"> PAGEREF _Toc227057605 \h </w:instrText>
+          <w:instrText xml:space="preserve"> PAGEREF _Toc227193425 \h </w:instrText>
         </w:r>
         <w:r>
           <w:rPr>
@@ -3337,7 +3239,7 @@
           <w:noProof/>
         </w:rPr>
       </w:pPr>
-      <w:hyperlink w:anchor="_Toc227057606" w:history="1">
+      <w:hyperlink w:anchor="_Toc227193426" w:history="1">
         <w:r>
           <w:rPr>
             <w:rStyle w:val="Hyperlink"/>
@@ -3365,7 +3267,7 @@
             <w:noProof/>
             <w:webHidden/>
           </w:rPr>
-          <w:instrText xml:space="preserve"> PAGEREF _Toc227057606 \h </w:instrText>
+          <w:instrText xml:space="preserve"> PAGEREF _Toc227193426 \h </w:instrText>
         </w:r>
         <w:r>
           <w:rPr>
@@ -3407,7 +3309,7 @@
           <w:noProof/>
         </w:rPr>
       </w:pPr>
-      <w:hyperlink w:anchor="_Toc227057607" w:history="1">
+      <w:hyperlink w:anchor="_Toc227193427" w:history="1">
         <w:r>
           <w:rPr>
             <w:rStyle w:val="Hyperlink"/>
@@ -3435,7 +3337,7 @@
             <w:noProof/>
             <w:webHidden/>
           </w:rPr>
-          <w:instrText xml:space="preserve"> PAGEREF _Toc227057607 \h </w:instrText>
+          <w:instrText xml:space="preserve"> PAGEREF _Toc227193427 \h </w:instrText>
         </w:r>
         <w:r>
           <w:rPr>
@@ -3657,7 +3559,7 @@
         </w:rPr>
       </w:pPr>
       <w:bookmarkStart w:id="0" w:name="_Toc226385505"/>
-      <w:bookmarkStart w:id="1" w:name="_Toc227057586"/>
+      <w:bookmarkStart w:id="1" w:name="_Toc227193407"/>
       <w:r>
         <w:rPr>
           <w:rFonts w:ascii="Times New Roman" w:hAnsi="Times New Roman" w:cs="Times New Roman"/>
@@ -3701,7 +3603,7 @@
         </w:rPr>
       </w:pPr>
       <w:bookmarkStart w:id="2" w:name="_Toc226385506"/>
-      <w:bookmarkStart w:id="3" w:name="_Toc227057587"/>
+      <w:bookmarkStart w:id="3" w:name="_Toc227193408"/>
       <w:r>
         <w:rPr>
           <w:rFonts w:ascii="Times New Roman" w:hAnsi="Times New Roman" w:cs="Times New Roman"/>
@@ -3734,7 +3636,7 @@
         </w:rPr>
       </w:pPr>
       <w:bookmarkStart w:id="4" w:name="_Toc226385507"/>
-      <w:bookmarkStart w:id="5" w:name="_Toc227057588"/>
+      <w:bookmarkStart w:id="5" w:name="_Toc227193409"/>
       <w:r>
         <w:rPr>
           <w:rFonts w:ascii="Times New Roman" w:hAnsi="Times New Roman" w:cs="Times New Roman"/>
@@ -4081,7 +3983,7 @@
         </w:rPr>
       </w:pPr>
       <w:bookmarkStart w:id="6" w:name="_Toc226385508"/>
-      <w:bookmarkStart w:id="7" w:name="_Toc227057589"/>
+      <w:bookmarkStart w:id="7" w:name="_Toc227193410"/>
       <w:r>
         <w:rPr>
           <w:rFonts w:ascii="Times New Roman" w:hAnsi="Times New Roman" w:cs="Times New Roman"/>
@@ -4411,7 +4313,7 @@
         </w:rPr>
       </w:pPr>
       <w:bookmarkStart w:id="8" w:name="_Toc226385509"/>
-      <w:bookmarkStart w:id="9" w:name="_Toc227057590"/>
+      <w:bookmarkStart w:id="9" w:name="_Toc227193411"/>
       <w:r>
         <w:rPr>
           <w:rFonts w:ascii="Times New Roman" w:hAnsi="Times New Roman" w:cs="Times New Roman"/>
@@ -4742,7 +4644,7 @@
         </w:rPr>
       </w:pPr>
       <w:bookmarkStart w:id="10" w:name="_Toc226385510"/>
-      <w:bookmarkStart w:id="11" w:name="_Toc227057591"/>
+      <w:bookmarkStart w:id="11" w:name="_Toc227193412"/>
       <w:r>
         <w:rPr>
           <w:rFonts w:ascii="Times New Roman" w:hAnsi="Times New Roman" w:cs="Times New Roman"/>
@@ -4765,39 +4667,20 @@
         </w:numPr>
         <w:spacing w:line="360" w:lineRule="auto"/>
         <w:jc w:val="both"/>
-        <w:outlineLvl w:val="1"/>
-        <w:rPr>
-          <w:rFonts w:ascii="Times New Roman" w:hAnsi="Times New Roman" w:cs="Times New Roman"/>
-          <w:sz w:val="26"/>
-          <w:szCs w:val="26"/>
-        </w:rPr>
-      </w:pPr>
-      <w:bookmarkStart w:id="12" w:name="_Toc227057592"/>
-      <w:r>
-        <w:rPr>
-          <w:rFonts w:ascii="Times New Roman" w:hAnsi="Times New Roman" w:cs="Times New Roman"/>
-          <w:sz w:val="26"/>
-          <w:szCs w:val="26"/>
-        </w:rPr>
-        <w:t>M</w:t>
-      </w:r>
-      <w:r>
-        <w:rPr>
-          <w:rFonts w:ascii="Times New Roman" w:hAnsi="Times New Roman" w:cs="Times New Roman"/>
-          <w:sz w:val="26"/>
-          <w:szCs w:val="26"/>
-        </w:rPr>
-        <w:t>ỗi</w:t>
-      </w:r>
-      <w:r>
-        <w:rPr>
-          <w:rFonts w:ascii="Times New Roman" w:hAnsi="Times New Roman" w:cs="Times New Roman"/>
-          <w:sz w:val="26"/>
-          <w:szCs w:val="26"/>
-        </w:rPr>
-        <w:t xml:space="preserve"> bộ phim có thời lượng tối thiểu là 60 phút và tối đa là 210 phút</w:t>
-      </w:r>
-      <w:bookmarkEnd w:id="12"/>
+        <w:rPr>
+          <w:rFonts w:ascii="Times New Roman" w:hAnsi="Times New Roman" w:cs="Times New Roman"/>
+          <w:sz w:val="26"/>
+          <w:szCs w:val="26"/>
+        </w:rPr>
+      </w:pPr>
+      <w:r>
+        <w:rPr>
+          <w:rFonts w:ascii="Times New Roman" w:hAnsi="Times New Roman" w:cs="Times New Roman"/>
+          <w:sz w:val="26"/>
+          <w:szCs w:val="26"/>
+        </w:rPr>
+        <w:t>Mỗi bộ phim có thời lượng tối thiểu là 60 phút và tối đa là 210 phút</w:t>
+      </w:r>
     </w:p>
     <w:p>
       <w:pPr>
@@ -5066,8 +4949,8 @@
           <w:szCs w:val="26"/>
         </w:rPr>
       </w:pPr>
-      <w:bookmarkStart w:id="13" w:name="_Toc226385511"/>
-      <w:bookmarkStart w:id="14" w:name="_Toc227057593"/>
+      <w:bookmarkStart w:id="12" w:name="_Toc226385511"/>
+      <w:bookmarkStart w:id="13" w:name="_Toc227193413"/>
       <w:r>
         <w:rPr>
           <w:rFonts w:ascii="Times New Roman" w:hAnsi="Times New Roman" w:cs="Times New Roman"/>
@@ -5078,8 +4961,8 @@
         </w:rPr>
         <w:t>Hướng xây dựng</w:t>
       </w:r>
+      <w:bookmarkEnd w:id="12"/>
       <w:bookmarkEnd w:id="13"/>
-      <w:bookmarkEnd w:id="14"/>
     </w:p>
     <w:p>
       <w:pPr>
@@ -5121,8 +5004,8 @@
           <w:szCs w:val="26"/>
         </w:rPr>
       </w:pPr>
-      <w:bookmarkStart w:id="15" w:name="_Toc226385512"/>
-      <w:bookmarkStart w:id="16" w:name="_Toc227057594"/>
+      <w:bookmarkStart w:id="14" w:name="_Toc226385512"/>
+      <w:bookmarkStart w:id="15" w:name="_Toc227193414"/>
       <w:r>
         <w:rPr>
           <w:rFonts w:ascii="Times New Roman" w:hAnsi="Times New Roman" w:cs="Times New Roman"/>
@@ -5133,8 +5016,8 @@
         </w:rPr>
         <w:t>Lược đồ E-R của hệ CSDL</w:t>
       </w:r>
+      <w:bookmarkEnd w:id="14"/>
       <w:bookmarkEnd w:id="15"/>
-      <w:bookmarkEnd w:id="16"/>
     </w:p>
     <w:p>
       <w:pPr>
@@ -5154,8 +5037,8 @@
           <w:szCs w:val="26"/>
         </w:rPr>
       </w:pPr>
-      <w:bookmarkStart w:id="17" w:name="_Toc226385513"/>
-      <w:bookmarkStart w:id="18" w:name="_Toc227057595"/>
+      <w:bookmarkStart w:id="16" w:name="_Toc226385513"/>
+      <w:bookmarkStart w:id="17" w:name="_Toc227193415"/>
       <w:r>
         <w:rPr>
           <w:rFonts w:ascii="Times New Roman" w:hAnsi="Times New Roman" w:cs="Times New Roman"/>
@@ -5166,8 +5049,8 @@
         </w:rPr>
         <w:t>Lược đồ E-R</w:t>
       </w:r>
+      <w:bookmarkEnd w:id="16"/>
       <w:bookmarkEnd w:id="17"/>
-      <w:bookmarkEnd w:id="18"/>
     </w:p>
     <w:p>
       <w:pPr>
@@ -5592,8 +5475,8 @@
           <w:szCs w:val="26"/>
         </w:rPr>
       </w:pPr>
-      <w:bookmarkStart w:id="19" w:name="_Toc226385514"/>
-      <w:bookmarkStart w:id="20" w:name="_Toc227057596"/>
+      <w:bookmarkStart w:id="18" w:name="_Toc226385514"/>
+      <w:bookmarkStart w:id="19" w:name="_Toc227193416"/>
       <w:r>
         <w:rPr>
           <w:rFonts w:ascii="Times New Roman" w:hAnsi="Times New Roman" w:cs="Times New Roman"/>
@@ -5604,8 +5487,8 @@
         </w:rPr>
         <w:t>Mô tả lược đồ E-R</w:t>
       </w:r>
+      <w:bookmarkEnd w:id="18"/>
       <w:bookmarkEnd w:id="19"/>
-      <w:bookmarkEnd w:id="20"/>
     </w:p>
     <w:p>
       <w:pPr>
@@ -5672,32 +5555,24 @@
           <w:lang w:val="en-US"/>
         </w:rPr>
       </w:pPr>
-      <w:bookmarkStart w:id="21" w:name="_Toc227057605"/>
-      <w:bookmarkStart w:id="22" w:name="_Toc225869346"/>
-      <w:bookmarkStart w:id="23" w:name="_Toc225869674"/>
+      <w:bookmarkStart w:id="20" w:name="_Toc225869346"/>
+      <w:bookmarkStart w:id="21" w:name="_Toc225869674"/>
+      <w:bookmarkStart w:id="22" w:name="_Toc227193425"/>
       <w:r>
         <w:rPr>
           <w:rFonts w:ascii="Times New Roman" w:hAnsi="Times New Roman" w:cs="Times New Roman"/>
         </w:rPr>
         <w:t>Hình 1. 1: Mô hình quan hệ thực thể ER</w:t>
       </w:r>
+      <w:bookmarkEnd w:id="22"/>
+      <w:r>
+        <w:rPr>
+          <w:rFonts w:ascii="Times New Roman" w:hAnsi="Times New Roman" w:cs="Times New Roman"/>
+        </w:rPr>
+        <w:t xml:space="preserve"> </w:t>
+      </w:r>
+      <w:bookmarkEnd w:id="20"/>
       <w:bookmarkEnd w:id="21"/>
-      <w:r>
-        <w:rPr>
-          <w:rFonts w:ascii="Times New Roman" w:hAnsi="Times New Roman" w:cs="Times New Roman"/>
-        </w:rPr>
-        <w:t xml:space="preserve"> </w:t>
-      </w:r>
-      <w:bookmarkEnd w:id="22"/>
-      <w:bookmarkEnd w:id="23"/>
-    </w:p>
-    <w:p>
-      <w:pPr>
-        <w:spacing w:line="360" w:lineRule="auto"/>
-        <w:rPr>
-          <w:rFonts w:ascii="Times New Roman" w:hAnsi="Times New Roman" w:cs="Times New Roman"/>
-        </w:rPr>
-      </w:pPr>
     </w:p>
     <w:p>
       <w:pPr>
@@ -5741,17 +5616,6 @@
           <w:szCs w:val="26"/>
         </w:rPr>
       </w:pPr>
-      <w:r>
-        <w:rPr>
-          <w:rFonts w:ascii="Times New Roman" w:hAnsi="Times New Roman" w:cs="Times New Roman"/>
-          <w:b/>
-          <w:bCs/>
-          <w:sz w:val="26"/>
-          <w:szCs w:val="26"/>
-        </w:rPr>
-        <w:lastRenderedPageBreak/>
-        <w:br w:type="page"/>
-      </w:r>
     </w:p>
     <w:p>
       <w:pPr>
@@ -7287,8 +7151,8 @@
           <w:szCs w:val="26"/>
         </w:rPr>
       </w:pPr>
-      <w:bookmarkStart w:id="24" w:name="_Toc226385515"/>
-      <w:bookmarkStart w:id="25" w:name="_Toc227057597"/>
+      <w:bookmarkStart w:id="23" w:name="_Toc226385515"/>
+      <w:bookmarkStart w:id="24" w:name="_Toc227193417"/>
       <w:r>
         <w:rPr>
           <w:rFonts w:ascii="Times New Roman" w:hAnsi="Times New Roman" w:cs="Times New Roman"/>
@@ -7300,8 +7164,8 @@
         <w:lastRenderedPageBreak/>
         <w:t>Lược đồ quan hệ và phụ thuộc hàm</w:t>
       </w:r>
+      <w:bookmarkEnd w:id="23"/>
       <w:bookmarkEnd w:id="24"/>
-      <w:bookmarkEnd w:id="25"/>
     </w:p>
     <w:p>
       <w:pPr>
@@ -7321,8 +7185,8 @@
           <w:szCs w:val="26"/>
         </w:rPr>
       </w:pPr>
-      <w:bookmarkStart w:id="26" w:name="_Toc226385516"/>
-      <w:bookmarkStart w:id="27" w:name="_Toc227057598"/>
+      <w:bookmarkStart w:id="25" w:name="_Toc226385516"/>
+      <w:bookmarkStart w:id="26" w:name="_Toc227193418"/>
       <w:r>
         <w:rPr>
           <w:rFonts w:ascii="Times New Roman" w:hAnsi="Times New Roman" w:cs="Times New Roman"/>
@@ -7333,8 +7197,8 @@
         </w:rPr>
         <w:t>Lược độ quan hệ mức logic</w:t>
       </w:r>
+      <w:bookmarkEnd w:id="25"/>
       <w:bookmarkEnd w:id="26"/>
-      <w:bookmarkEnd w:id="27"/>
     </w:p>
     <w:p>
       <w:pPr>
@@ -7401,7 +7265,7 @@
           <w:lang w:val="en-US"/>
         </w:rPr>
       </w:pPr>
-      <w:bookmarkStart w:id="28" w:name="_Toc227057606"/>
+      <w:bookmarkStart w:id="27" w:name="_Toc227193426"/>
       <w:r>
         <w:rPr>
           <w:rFonts w:ascii="Times New Roman" w:hAnsi="Times New Roman" w:cs="Times New Roman"/>
@@ -7415,7 +7279,7 @@
         </w:rPr>
         <w:t>ựa trên lược đồ ER trong hình 1.1</w:t>
       </w:r>
-      <w:bookmarkEnd w:id="28"/>
+      <w:bookmarkEnd w:id="27"/>
     </w:p>
     <w:p>
       <w:pPr>
@@ -8489,7 +8353,6 @@
                 <w:szCs w:val="26"/>
                 <w:lang w:val="fr-FR"/>
               </w:rPr>
-              <w:lastRenderedPageBreak/>
               <w:t xml:space="preserve">Phancong( </w:t>
             </w:r>
             <w:r>
@@ -8672,8 +8535,8 @@
           <w:lang w:val="fr-FR"/>
         </w:rPr>
       </w:pPr>
-      <w:bookmarkStart w:id="29" w:name="_Toc226385517"/>
-      <w:bookmarkStart w:id="30" w:name="_Toc227057599"/>
+      <w:bookmarkStart w:id="28" w:name="_Toc226385517"/>
+      <w:bookmarkStart w:id="29" w:name="_Toc227193419"/>
       <w:r>
         <w:rPr>
           <w:rFonts w:ascii="Times New Roman" w:hAnsi="Times New Roman" w:cs="Times New Roman"/>
@@ -8685,8 +8548,8 @@
         </w:rPr>
         <w:t>Phụ thuộc hàm và chuẩn hóa</w:t>
       </w:r>
+      <w:bookmarkEnd w:id="28"/>
       <w:bookmarkEnd w:id="29"/>
-      <w:bookmarkEnd w:id="30"/>
     </w:p>
     <w:p>
       <w:pPr>
@@ -8708,8 +8571,8 @@
           <w:lang w:val="fr-FR"/>
         </w:rPr>
       </w:pPr>
-      <w:bookmarkStart w:id="31" w:name="_Toc226385518"/>
-      <w:bookmarkStart w:id="32" w:name="_Toc227057600"/>
+      <w:bookmarkStart w:id="30" w:name="_Toc226385518"/>
+      <w:bookmarkStart w:id="31" w:name="_Toc227193420"/>
       <w:r>
         <w:rPr>
           <w:rFonts w:ascii="Times New Roman" w:hAnsi="Times New Roman" w:cs="Times New Roman"/>
@@ -8721,8 +8584,8 @@
         </w:rPr>
         <w:t>Định nghĩa</w:t>
       </w:r>
+      <w:bookmarkEnd w:id="30"/>
       <w:bookmarkEnd w:id="31"/>
-      <w:bookmarkEnd w:id="32"/>
     </w:p>
     <w:p>
       <w:pPr>
@@ -8862,8 +8725,8 @@
           <w:lang w:val="fr-FR"/>
         </w:rPr>
       </w:pPr>
-      <w:bookmarkStart w:id="33" w:name="_Toc226385519"/>
-      <w:bookmarkStart w:id="34" w:name="_Toc227057601"/>
+      <w:bookmarkStart w:id="32" w:name="_Toc226385519"/>
+      <w:bookmarkStart w:id="33" w:name="_Toc227193421"/>
       <w:r>
         <w:rPr>
           <w:rFonts w:ascii="Times New Roman" w:hAnsi="Times New Roman" w:cs="Times New Roman"/>
@@ -8876,8 +8739,8 @@
         <w:lastRenderedPageBreak/>
         <w:t>Xây dựng phụ thuộc hàm và chuẩn hóa từng lược đồ quan hệ</w:t>
       </w:r>
+      <w:bookmarkEnd w:id="32"/>
       <w:bookmarkEnd w:id="33"/>
-      <w:bookmarkEnd w:id="34"/>
     </w:p>
     <w:p>
       <w:pPr>
@@ -11209,8 +11072,8 @@
           <w:lang w:val="fr-FR"/>
         </w:rPr>
       </w:pPr>
-      <w:bookmarkStart w:id="35" w:name="_Toc226385520"/>
-      <w:bookmarkStart w:id="36" w:name="_Toc227057602"/>
+      <w:bookmarkStart w:id="34" w:name="_Toc226385520"/>
+      <w:bookmarkStart w:id="35" w:name="_Toc227193422"/>
       <w:r>
         <w:rPr>
           <w:rFonts w:ascii="Times New Roman" w:hAnsi="Times New Roman" w:cs="Times New Roman"/>
@@ -11222,8 +11085,8 @@
         </w:rPr>
         <w:t>Lược đồ CSDL ở mức logic</w:t>
       </w:r>
+      <w:bookmarkEnd w:id="34"/>
       <w:bookmarkEnd w:id="35"/>
-      <w:bookmarkEnd w:id="36"/>
     </w:p>
     <w:p>
       <w:pPr>
@@ -11306,24 +11169,24 @@
           <w:lang w:val="en-US"/>
         </w:rPr>
       </w:pPr>
-      <w:bookmarkStart w:id="37" w:name="_Toc227057607"/>
-      <w:bookmarkStart w:id="38" w:name="_Toc225869353"/>
-      <w:bookmarkStart w:id="39" w:name="_Toc225869837"/>
+      <w:bookmarkStart w:id="36" w:name="_Toc225869353"/>
+      <w:bookmarkStart w:id="37" w:name="_Toc225869837"/>
+      <w:bookmarkStart w:id="38" w:name="_Toc227193427"/>
       <w:r>
         <w:rPr>
           <w:rFonts w:ascii="Times New Roman" w:hAnsi="Times New Roman" w:cs="Times New Roman"/>
         </w:rPr>
         <w:t>Hình 1.3: Lược đồ CSDL mức logic</w:t>
       </w:r>
+      <w:bookmarkEnd w:id="38"/>
+      <w:r>
+        <w:rPr>
+          <w:rFonts w:ascii="Times New Roman" w:hAnsi="Times New Roman" w:cs="Times New Roman"/>
+        </w:rPr>
+        <w:t xml:space="preserve"> </w:t>
+      </w:r>
+      <w:bookmarkEnd w:id="36"/>
       <w:bookmarkEnd w:id="37"/>
-      <w:r>
-        <w:rPr>
-          <w:rFonts w:ascii="Times New Roman" w:hAnsi="Times New Roman" w:cs="Times New Roman"/>
-        </w:rPr>
-        <w:t xml:space="preserve"> </w:t>
-      </w:r>
-      <w:bookmarkEnd w:id="38"/>
-      <w:bookmarkEnd w:id="39"/>
     </w:p>
     <w:p>
       <w:pPr>
@@ -11375,8 +11238,8 @@
           <w:szCs w:val="26"/>
         </w:rPr>
       </w:pPr>
-      <w:bookmarkStart w:id="40" w:name="_Toc226385521"/>
-      <w:bookmarkStart w:id="41" w:name="_Toc227057603"/>
+      <w:bookmarkStart w:id="39" w:name="_Toc226385521"/>
+      <w:bookmarkStart w:id="40" w:name="_Toc227193423"/>
       <w:r>
         <w:rPr>
           <w:rFonts w:ascii="Times New Roman" w:hAnsi="Times New Roman" w:cs="Times New Roman"/>
@@ -11986,8 +11849,8 @@
         </w:rPr>
         <w:t>Lệnh xây dựng đủ các bảng, ràng buộc sau khi chuẩn hóa.</w:t>
       </w:r>
+      <w:bookmarkEnd w:id="39"/>
       <w:bookmarkEnd w:id="40"/>
-      <w:bookmarkEnd w:id="41"/>
     </w:p>
     <w:p>
       <w:pPr>
@@ -19115,7 +18978,7 @@
           </w14:textOutline>
         </w:rPr>
       </w:pPr>
-      <w:bookmarkStart w:id="42" w:name="_Toc226385522"/>
+      <w:bookmarkStart w:id="41" w:name="_Toc226385522"/>
       <w:r>
         <w:rPr>
           <w:rFonts w:ascii="Times New Roman" w:hAnsi="Times New Roman" w:cs="Times New Roman"/>
@@ -22780,7 +22643,7 @@
           </w14:textOutline>
         </w:rPr>
       </w:pPr>
-      <w:bookmarkStart w:id="43" w:name="_Toc227057604"/>
+      <w:bookmarkStart w:id="42" w:name="_Toc227193424"/>
       <w:r>
         <w:rPr>
           <w:rFonts w:ascii="Times New Roman" w:hAnsi="Times New Roman" w:cs="Times New Roman"/>
@@ -22802,8 +22665,8 @@
         <w:lastRenderedPageBreak/>
         <w:t>CHƯƠNG 2 : TRIỂN KHAI CƠ SỞ DỮ LIỆU TRÊN ỨNG DỤNG</w:t>
       </w:r>
+      <w:bookmarkEnd w:id="41"/>
       <w:bookmarkEnd w:id="42"/>
-      <w:bookmarkEnd w:id="43"/>
     </w:p>
     <w:p>
       <w:pPr>
@@ -25262,6 +25125,119 @@
     </w:lvl>
   </w:abstractNum>
   <w:abstractNum w:abstractNumId="14" w15:restartNumberingAfterBreak="0">
+    <w:nsid w:val="2F4E7A39"/>
+    <w:multiLevelType w:val="hybridMultilevel"/>
+    <w:tmpl w:val="3B906FD6"/>
+    <w:lvl w:ilvl="0" w:tplc="04090001">
+      <w:start w:val="1"/>
+      <w:numFmt w:val="bullet"/>
+      <w:lvlText w:val=""/>
+      <w:lvlJc w:val="left"/>
+      <w:pPr>
+        <w:ind w:left="720" w:hanging="360"/>
+      </w:pPr>
+      <w:rPr>
+        <w:rFonts w:ascii="Symbol" w:hAnsi="Symbol" w:hint="default"/>
+      </w:rPr>
+    </w:lvl>
+    <w:lvl w:ilvl="1" w:tplc="04090003" w:tentative="1">
+      <w:start w:val="1"/>
+      <w:numFmt w:val="bullet"/>
+      <w:lvlText w:val="o"/>
+      <w:lvlJc w:val="left"/>
+      <w:pPr>
+        <w:ind w:left="1440" w:hanging="360"/>
+      </w:pPr>
+      <w:rPr>
+        <w:rFonts w:ascii="Courier New" w:hAnsi="Courier New" w:cs="Courier New" w:hint="default"/>
+      </w:rPr>
+    </w:lvl>
+    <w:lvl w:ilvl="2" w:tplc="04090005" w:tentative="1">
+      <w:start w:val="1"/>
+      <w:numFmt w:val="bullet"/>
+      <w:lvlText w:val=""/>
+      <w:lvlJc w:val="left"/>
+      <w:pPr>
+        <w:ind w:left="2160" w:hanging="360"/>
+      </w:pPr>
+      <w:rPr>
+        <w:rFonts w:ascii="Wingdings" w:hAnsi="Wingdings" w:hint="default"/>
+      </w:rPr>
+    </w:lvl>
+    <w:lvl w:ilvl="3" w:tplc="04090001" w:tentative="1">
+      <w:start w:val="1"/>
+      <w:numFmt w:val="bullet"/>
+      <w:lvlText w:val=""/>
+      <w:lvlJc w:val="left"/>
+      <w:pPr>
+        <w:ind w:left="2880" w:hanging="360"/>
+      </w:pPr>
+      <w:rPr>
+        <w:rFonts w:ascii="Symbol" w:hAnsi="Symbol" w:hint="default"/>
+      </w:rPr>
+    </w:lvl>
+    <w:lvl w:ilvl="4" w:tplc="04090003" w:tentative="1">
+      <w:start w:val="1"/>
+      <w:numFmt w:val="bullet"/>
+      <w:lvlText w:val="o"/>
+      <w:lvlJc w:val="left"/>
+      <w:pPr>
+        <w:ind w:left="3600" w:hanging="360"/>
+      </w:pPr>
+      <w:rPr>
+        <w:rFonts w:ascii="Courier New" w:hAnsi="Courier New" w:cs="Courier New" w:hint="default"/>
+      </w:rPr>
+    </w:lvl>
+    <w:lvl w:ilvl="5" w:tplc="04090005" w:tentative="1">
+      <w:start w:val="1"/>
+      <w:numFmt w:val="bullet"/>
+      <w:lvlText w:val=""/>
+      <w:lvlJc w:val="left"/>
+      <w:pPr>
+        <w:ind w:left="4320" w:hanging="360"/>
+      </w:pPr>
+      <w:rPr>
+        <w:rFonts w:ascii="Wingdings" w:hAnsi="Wingdings" w:hint="default"/>
+      </w:rPr>
+    </w:lvl>
+    <w:lvl w:ilvl="6" w:tplc="04090001" w:tentative="1">
+      <w:start w:val="1"/>
+      <w:numFmt w:val="bullet"/>
+      <w:lvlText w:val=""/>
+      <w:lvlJc w:val="left"/>
+      <w:pPr>
+        <w:ind w:left="5040" w:hanging="360"/>
+      </w:pPr>
+      <w:rPr>
+        <w:rFonts w:ascii="Symbol" w:hAnsi="Symbol" w:hint="default"/>
+      </w:rPr>
+    </w:lvl>
+    <w:lvl w:ilvl="7" w:tplc="04090003" w:tentative="1">
+      <w:start w:val="1"/>
+      <w:numFmt w:val="bullet"/>
+      <w:lvlText w:val="o"/>
+      <w:lvlJc w:val="left"/>
+      <w:pPr>
+        <w:ind w:left="5760" w:hanging="360"/>
+      </w:pPr>
+      <w:rPr>
+        <w:rFonts w:ascii="Courier New" w:hAnsi="Courier New" w:cs="Courier New" w:hint="default"/>
+      </w:rPr>
+    </w:lvl>
+    <w:lvl w:ilvl="8" w:tplc="04090005" w:tentative="1">
+      <w:start w:val="1"/>
+      <w:numFmt w:val="bullet"/>
+      <w:lvlText w:val=""/>
+      <w:lvlJc w:val="left"/>
+      <w:pPr>
+        <w:ind w:left="6480" w:hanging="360"/>
+      </w:pPr>
+      <w:rPr>
+        <w:rFonts w:ascii="Wingdings" w:hAnsi="Wingdings" w:hint="default"/>
+      </w:rPr>
+    </w:lvl>
+  </w:abstractNum>
+  <w:abstractNum w:abstractNumId="15" w15:restartNumberingAfterBreak="0">
     <w:nsid w:val="340A0FDE"/>
     <w:multiLevelType w:val="hybridMultilevel"/>
     <w:tmpl w:val="FB36F202"/>
@@ -25374,7 +25350,7 @@
       </w:rPr>
     </w:lvl>
   </w:abstractNum>
-  <w:abstractNum w:abstractNumId="15" w15:restartNumberingAfterBreak="0">
+  <w:abstractNum w:abstractNumId="16" w15:restartNumberingAfterBreak="0">
     <w:nsid w:val="37C839A8"/>
     <w:multiLevelType w:val="hybridMultilevel"/>
     <w:tmpl w:val="38CAFAA4"/>
@@ -25487,7 +25463,7 @@
       </w:rPr>
     </w:lvl>
   </w:abstractNum>
-  <w:abstractNum w:abstractNumId="16" w15:restartNumberingAfterBreak="0">
+  <w:abstractNum w:abstractNumId="17" w15:restartNumberingAfterBreak="0">
     <w:nsid w:val="38E57888"/>
     <w:multiLevelType w:val="hybridMultilevel"/>
     <w:tmpl w:val="9D8EEB9C"/>
@@ -25600,7 +25576,7 @@
       </w:rPr>
     </w:lvl>
   </w:abstractNum>
-  <w:abstractNum w:abstractNumId="17" w15:restartNumberingAfterBreak="0">
+  <w:abstractNum w:abstractNumId="18" w15:restartNumberingAfterBreak="0">
     <w:nsid w:val="399E29F6"/>
     <w:multiLevelType w:val="hybridMultilevel"/>
     <w:tmpl w:val="17300AF0"/>
@@ -25713,7 +25689,7 @@
       </w:rPr>
     </w:lvl>
   </w:abstractNum>
-  <w:abstractNum w:abstractNumId="18" w15:restartNumberingAfterBreak="0">
+  <w:abstractNum w:abstractNumId="19" w15:restartNumberingAfterBreak="0">
     <w:nsid w:val="3E58016F"/>
     <w:multiLevelType w:val="hybridMultilevel"/>
     <w:tmpl w:val="76B22212"/>
@@ -25826,7 +25802,7 @@
       </w:rPr>
     </w:lvl>
   </w:abstractNum>
-  <w:abstractNum w:abstractNumId="19" w15:restartNumberingAfterBreak="0">
+  <w:abstractNum w:abstractNumId="20" w15:restartNumberingAfterBreak="0">
     <w:nsid w:val="3EAD3A41"/>
     <w:multiLevelType w:val="hybridMultilevel"/>
     <w:tmpl w:val="FF0AA544"/>
@@ -25939,7 +25915,7 @@
       </w:rPr>
     </w:lvl>
   </w:abstractNum>
-  <w:abstractNum w:abstractNumId="20" w15:restartNumberingAfterBreak="0">
+  <w:abstractNum w:abstractNumId="21" w15:restartNumberingAfterBreak="0">
     <w:nsid w:val="3F0F7086"/>
     <w:multiLevelType w:val="hybridMultilevel"/>
     <w:tmpl w:val="297A78AE"/>
@@ -26052,7 +26028,7 @@
       </w:rPr>
     </w:lvl>
   </w:abstractNum>
-  <w:abstractNum w:abstractNumId="21" w15:restartNumberingAfterBreak="0">
+  <w:abstractNum w:abstractNumId="22" w15:restartNumberingAfterBreak="0">
     <w:nsid w:val="3F957F47"/>
     <w:multiLevelType w:val="hybridMultilevel"/>
     <w:tmpl w:val="852EB09C"/>
@@ -26165,7 +26141,7 @@
       </w:rPr>
     </w:lvl>
   </w:abstractNum>
-  <w:abstractNum w:abstractNumId="22" w15:restartNumberingAfterBreak="0">
+  <w:abstractNum w:abstractNumId="23" w15:restartNumberingAfterBreak="0">
     <w:nsid w:val="41657A58"/>
     <w:multiLevelType w:val="hybridMultilevel"/>
     <w:tmpl w:val="C046D692"/>
@@ -26278,7 +26254,7 @@
       </w:rPr>
     </w:lvl>
   </w:abstractNum>
-  <w:abstractNum w:abstractNumId="23" w15:restartNumberingAfterBreak="0">
+  <w:abstractNum w:abstractNumId="24" w15:restartNumberingAfterBreak="0">
     <w:nsid w:val="43F1307D"/>
     <w:multiLevelType w:val="hybridMultilevel"/>
     <w:tmpl w:val="F4CE2224"/>
@@ -26391,7 +26367,7 @@
       </w:rPr>
     </w:lvl>
   </w:abstractNum>
-  <w:abstractNum w:abstractNumId="24" w15:restartNumberingAfterBreak="0">
+  <w:abstractNum w:abstractNumId="25" w15:restartNumberingAfterBreak="0">
     <w:nsid w:val="452673B7"/>
     <w:multiLevelType w:val="hybridMultilevel"/>
     <w:tmpl w:val="0B089F2E"/>
@@ -26504,7 +26480,7 @@
       </w:rPr>
     </w:lvl>
   </w:abstractNum>
-  <w:abstractNum w:abstractNumId="25" w15:restartNumberingAfterBreak="0">
+  <w:abstractNum w:abstractNumId="26" w15:restartNumberingAfterBreak="0">
     <w:nsid w:val="496562E8"/>
     <w:multiLevelType w:val="hybridMultilevel"/>
     <w:tmpl w:val="4D147038"/>
@@ -26617,7 +26593,7 @@
       </w:rPr>
     </w:lvl>
   </w:abstractNum>
-  <w:abstractNum w:abstractNumId="26" w15:restartNumberingAfterBreak="0">
+  <w:abstractNum w:abstractNumId="27" w15:restartNumberingAfterBreak="0">
     <w:nsid w:val="51474923"/>
     <w:multiLevelType w:val="hybridMultilevel"/>
     <w:tmpl w:val="37ECA84E"/>
@@ -26730,7 +26706,7 @@
       </w:rPr>
     </w:lvl>
   </w:abstractNum>
-  <w:abstractNum w:abstractNumId="27" w15:restartNumberingAfterBreak="0">
+  <w:abstractNum w:abstractNumId="28" w15:restartNumberingAfterBreak="0">
     <w:nsid w:val="52387E3A"/>
     <w:multiLevelType w:val="hybridMultilevel"/>
     <w:tmpl w:val="22C2CC54"/>
@@ -26843,7 +26819,7 @@
       </w:rPr>
     </w:lvl>
   </w:abstractNum>
-  <w:abstractNum w:abstractNumId="28" w15:restartNumberingAfterBreak="0">
+  <w:abstractNum w:abstractNumId="29" w15:restartNumberingAfterBreak="0">
     <w:nsid w:val="53E66CE9"/>
     <w:multiLevelType w:val="hybridMultilevel"/>
     <w:tmpl w:val="E3C80D18"/>
@@ -26956,7 +26932,7 @@
       </w:rPr>
     </w:lvl>
   </w:abstractNum>
-  <w:abstractNum w:abstractNumId="29" w15:restartNumberingAfterBreak="0">
+  <w:abstractNum w:abstractNumId="30" w15:restartNumberingAfterBreak="0">
     <w:nsid w:val="5A315333"/>
     <w:multiLevelType w:val="hybridMultilevel"/>
     <w:tmpl w:val="2C564826"/>
@@ -27069,7 +27045,7 @@
       </w:rPr>
     </w:lvl>
   </w:abstractNum>
-  <w:abstractNum w:abstractNumId="30" w15:restartNumberingAfterBreak="0">
+  <w:abstractNum w:abstractNumId="31" w15:restartNumberingAfterBreak="0">
     <w:nsid w:val="69CA4164"/>
     <w:multiLevelType w:val="multilevel"/>
     <w:tmpl w:val="B6F6B214"/>
@@ -27182,7 +27158,7 @@
       </w:rPr>
     </w:lvl>
   </w:abstractNum>
-  <w:abstractNum w:abstractNumId="31" w15:restartNumberingAfterBreak="0">
+  <w:abstractNum w:abstractNumId="32" w15:restartNumberingAfterBreak="0">
     <w:nsid w:val="6BB674C5"/>
     <w:multiLevelType w:val="hybridMultilevel"/>
     <w:tmpl w:val="0CF800FE"/>
@@ -27295,7 +27271,7 @@
       </w:rPr>
     </w:lvl>
   </w:abstractNum>
-  <w:abstractNum w:abstractNumId="32" w15:restartNumberingAfterBreak="0">
+  <w:abstractNum w:abstractNumId="33" w15:restartNumberingAfterBreak="0">
     <w:nsid w:val="74F227A9"/>
     <w:multiLevelType w:val="hybridMultilevel"/>
     <w:tmpl w:val="6C3EDF02"/>
@@ -27408,7 +27384,7 @@
       </w:rPr>
     </w:lvl>
   </w:abstractNum>
-  <w:abstractNum w:abstractNumId="33" w15:restartNumberingAfterBreak="0">
+  <w:abstractNum w:abstractNumId="34" w15:restartNumberingAfterBreak="0">
     <w:nsid w:val="7D016BCB"/>
     <w:multiLevelType w:val="hybridMultilevel"/>
     <w:tmpl w:val="6C8E23D0"/>
@@ -27522,19 +27498,19 @@
     </w:lvl>
   </w:abstractNum>
   <w:num w:numId="1" w16cid:durableId="213127409">
-    <w:abstractNumId w:val="30"/>
+    <w:abstractNumId w:val="31"/>
   </w:num>
   <w:num w:numId="2" w16cid:durableId="1572808743">
     <w:abstractNumId w:val="6"/>
   </w:num>
   <w:num w:numId="3" w16cid:durableId="1002047607">
-    <w:abstractNumId w:val="21"/>
+    <w:abstractNumId w:val="22"/>
   </w:num>
   <w:num w:numId="4" w16cid:durableId="144277068">
     <w:abstractNumId w:val="2"/>
   </w:num>
   <w:num w:numId="5" w16cid:durableId="229080834">
-    <w:abstractNumId w:val="19"/>
+    <w:abstractNumId w:val="20"/>
   </w:num>
   <w:num w:numId="6" w16cid:durableId="398096147">
     <w:abstractNumId w:val="1"/>
@@ -27543,28 +27519,28 @@
     <w:abstractNumId w:val="5"/>
   </w:num>
   <w:num w:numId="8" w16cid:durableId="1130391967">
-    <w:abstractNumId w:val="24"/>
+    <w:abstractNumId w:val="25"/>
   </w:num>
   <w:num w:numId="9" w16cid:durableId="2088263508">
-    <w:abstractNumId w:val="29"/>
+    <w:abstractNumId w:val="30"/>
   </w:num>
   <w:num w:numId="10" w16cid:durableId="197477246">
-    <w:abstractNumId w:val="32"/>
+    <w:abstractNumId w:val="33"/>
   </w:num>
   <w:num w:numId="11" w16cid:durableId="211310751">
-    <w:abstractNumId w:val="26"/>
+    <w:abstractNumId w:val="27"/>
   </w:num>
   <w:num w:numId="12" w16cid:durableId="30883126">
     <w:abstractNumId w:val="3"/>
   </w:num>
   <w:num w:numId="13" w16cid:durableId="1028095436">
-    <w:abstractNumId w:val="22"/>
+    <w:abstractNumId w:val="23"/>
   </w:num>
   <w:num w:numId="14" w16cid:durableId="1720547040">
-    <w:abstractNumId w:val="20"/>
+    <w:abstractNumId w:val="21"/>
   </w:num>
   <w:num w:numId="15" w16cid:durableId="1899433689">
-    <w:abstractNumId w:val="28"/>
+    <w:abstractNumId w:val="29"/>
   </w:num>
   <w:num w:numId="16" w16cid:durableId="357320889">
     <w:abstractNumId w:val="11"/>
@@ -27579,49 +27555,52 @@
     <w:abstractNumId w:val="7"/>
   </w:num>
   <w:num w:numId="20" w16cid:durableId="2033914952">
-    <w:abstractNumId w:val="17"/>
+    <w:abstractNumId w:val="18"/>
   </w:num>
   <w:num w:numId="21" w16cid:durableId="98454601">
-    <w:abstractNumId w:val="23"/>
+    <w:abstractNumId w:val="24"/>
   </w:num>
   <w:num w:numId="22" w16cid:durableId="988287738">
     <w:abstractNumId w:val="12"/>
   </w:num>
   <w:num w:numId="23" w16cid:durableId="215052181">
-    <w:abstractNumId w:val="33"/>
+    <w:abstractNumId w:val="34"/>
   </w:num>
   <w:num w:numId="24" w16cid:durableId="467893871">
     <w:abstractNumId w:val="13"/>
   </w:num>
   <w:num w:numId="25" w16cid:durableId="347683441">
-    <w:abstractNumId w:val="18"/>
+    <w:abstractNumId w:val="19"/>
   </w:num>
   <w:num w:numId="26" w16cid:durableId="1864779562">
-    <w:abstractNumId w:val="25"/>
+    <w:abstractNumId w:val="26"/>
   </w:num>
   <w:num w:numId="27" w16cid:durableId="254948072">
     <w:abstractNumId w:val="8"/>
   </w:num>
   <w:num w:numId="28" w16cid:durableId="1592736322">
-    <w:abstractNumId w:val="14"/>
+    <w:abstractNumId w:val="15"/>
   </w:num>
   <w:num w:numId="29" w16cid:durableId="1411271519">
-    <w:abstractNumId w:val="15"/>
+    <w:abstractNumId w:val="16"/>
   </w:num>
   <w:num w:numId="30" w16cid:durableId="1550337473">
-    <w:abstractNumId w:val="16"/>
+    <w:abstractNumId w:val="17"/>
   </w:num>
   <w:num w:numId="31" w16cid:durableId="932934267">
     <w:abstractNumId w:val="10"/>
   </w:num>
   <w:num w:numId="32" w16cid:durableId="758021054">
-    <w:abstractNumId w:val="31"/>
+    <w:abstractNumId w:val="32"/>
   </w:num>
   <w:num w:numId="33" w16cid:durableId="749500686">
-    <w:abstractNumId w:val="27"/>
+    <w:abstractNumId w:val="28"/>
   </w:num>
   <w:num w:numId="34" w16cid:durableId="1480342775">
     <w:abstractNumId w:val="4"/>
+  </w:num>
+  <w:num w:numId="35" w16cid:durableId="896357565">
+    <w:abstractNumId w:val="14"/>
   </w:num>
 </w:numbering>
 </file>

</xml_diff>